<commit_message>
Bao cao: mo rong muc 3.2 (Tang AI) len 4 muc con, bao cao dat 11 trang
- 3.2.1 Kien truc mo hinh: giai thich vi sao chon MLP thay vi CNN/RNN
- 3.2.2 Huan luyen cuc bo: bang sieu tham so (optimizer, lr, epoch,
  batch size, loss) lay dung tu ai_model/local_train.py
- 3.2.3 Tong hop FedAvg: giai thich cong thuc trong so theo so mau,
  vi sao tinh off-chain
- 3.2.4 Vong lap huan luyen: 7 buoc chi tiet + vi sao danh gia tren
  tap test gop
- Bao cao tu 9 -> 11 trang, dat yeu cau 10-15 trang cua de bai
</commit_message>
<xml_diff>
--- a/Report_NhomXX.docx
+++ b/Report_NhomXX.docx
@@ -189,7 +189,7 @@
           <w:left w:w="10" w:type="dxa"/>
           <w:right w:w="10" w:type="dxa"/>
         </w:tblCellMar>
-        <w:tblLook w:val="04A0" w:firstRow="1" w:lastRow="0" w:firstColumn="1" w:lastColumn="0" w:noHBand="0" w:noVBand="1"/>
+        <w:tblLook w:val="0000" w:firstRow="0" w:lastRow="0" w:firstColumn="0" w:lastColumn="0" w:noHBand="0" w:noVBand="0"/>
       </w:tblPr>
       <w:tblGrid>
         <w:gridCol w:w="995"/>
@@ -600,7 +600,7 @@
         <w:pStyle w:val="Heading1"/>
         <w:spacing w:before="320" w:after="160"/>
       </w:pPr>
-      <w:bookmarkStart w:id="0" w:name="_Toc240098580"/>
+      <w:bookmarkStart w:id="0" w:name="_Toc240098945"/>
       <w:r>
         <w:t>Mục lục</w:t>
       </w:r>
@@ -609,7 +609,7 @@
     <w:sdt>
       <w:sdtPr>
         <w:alias w:val="Mục lục"/>
-        <w:id w:val="866412746"/>
+        <w:id w:val="1993058239"/>
       </w:sdtPr>
       <w:sdtEndPr/>
       <w:sdtContent>
@@ -638,7 +638,7 @@
           <w:r>
             <w:fldChar w:fldCharType="separate"/>
           </w:r>
-          <w:hyperlink w:anchor="_Toc240098580" w:history="1">
+          <w:hyperlink w:anchor="_Toc240098945" w:history="1">
             <w:r>
               <w:rPr>
                 <w:rStyle w:val="Hyperlink"/>
@@ -662,7 +662,7 @@
               <w:rPr>
                 <w:noProof/>
               </w:rPr>
-              <w:instrText xml:space="preserve"> PAGEREF _Toc240098580 \h </w:instrText>
+              <w:instrText xml:space="preserve"> PAGEREF _Toc240098945 \h </w:instrText>
             </w:r>
             <w:r>
               <w:rPr>
@@ -705,7 +705,7 @@
               <w14:ligatures w14:val="standardContextual"/>
             </w:rPr>
           </w:pPr>
-          <w:hyperlink w:anchor="_Toc240098581" w:history="1">
+          <w:hyperlink w:anchor="_Toc240098946" w:history="1">
             <w:r>
               <w:rPr>
                 <w:rStyle w:val="Hyperlink"/>
@@ -729,7 +729,7 @@
               <w:rPr>
                 <w:noProof/>
               </w:rPr>
-              <w:instrText xml:space="preserve"> PAGEREF _Toc240098581 \h </w:instrText>
+              <w:instrText xml:space="preserve"> PAGEREF _Toc240098946 \h </w:instrText>
             </w:r>
             <w:r>
               <w:rPr>
@@ -772,7 +772,7 @@
               <w14:ligatures w14:val="standardContextual"/>
             </w:rPr>
           </w:pPr>
-          <w:hyperlink w:anchor="_Toc240098582" w:history="1">
+          <w:hyperlink w:anchor="_Toc240098947" w:history="1">
             <w:r>
               <w:rPr>
                 <w:rStyle w:val="Hyperlink"/>
@@ -796,7 +796,7 @@
               <w:rPr>
                 <w:noProof/>
               </w:rPr>
-              <w:instrText xml:space="preserve"> PAGEREF _Toc240098582 \h </w:instrText>
+              <w:instrText xml:space="preserve"> PAGEREF _Toc240098947 \h </w:instrText>
             </w:r>
             <w:r>
               <w:rPr>
@@ -839,7 +839,7 @@
               <w14:ligatures w14:val="standardContextual"/>
             </w:rPr>
           </w:pPr>
-          <w:hyperlink w:anchor="_Toc240098583" w:history="1">
+          <w:hyperlink w:anchor="_Toc240098948" w:history="1">
             <w:r>
               <w:rPr>
                 <w:rStyle w:val="Hyperlink"/>
@@ -863,7 +863,7 @@
               <w:rPr>
                 <w:noProof/>
               </w:rPr>
-              <w:instrText xml:space="preserve"> PAGEREF _Toc240098583 \h </w:instrText>
+              <w:instrText xml:space="preserve"> PAGEREF _Toc240098948 \h </w:instrText>
             </w:r>
             <w:r>
               <w:rPr>
@@ -906,7 +906,7 @@
               <w14:ligatures w14:val="standardContextual"/>
             </w:rPr>
           </w:pPr>
-          <w:hyperlink w:anchor="_Toc240098584" w:history="1">
+          <w:hyperlink w:anchor="_Toc240098949" w:history="1">
             <w:r>
               <w:rPr>
                 <w:rStyle w:val="Hyperlink"/>
@@ -930,7 +930,7 @@
               <w:rPr>
                 <w:noProof/>
               </w:rPr>
-              <w:instrText xml:space="preserve"> PAGEREF _Toc240098584 \h </w:instrText>
+              <w:instrText xml:space="preserve"> PAGEREF _Toc240098949 \h </w:instrText>
             </w:r>
             <w:r>
               <w:rPr>
@@ -973,7 +973,7 @@
               <w14:ligatures w14:val="standardContextual"/>
             </w:rPr>
           </w:pPr>
-          <w:hyperlink w:anchor="_Toc240098585" w:history="1">
+          <w:hyperlink w:anchor="_Toc240098950" w:history="1">
             <w:r>
               <w:rPr>
                 <w:rStyle w:val="Hyperlink"/>
@@ -997,7 +997,7 @@
               <w:rPr>
                 <w:noProof/>
               </w:rPr>
-              <w:instrText xml:space="preserve"> PAGEREF _Toc240098585 \h </w:instrText>
+              <w:instrText xml:space="preserve"> PAGEREF _Toc240098950 \h </w:instrText>
             </w:r>
             <w:r>
               <w:rPr>
@@ -1040,7 +1040,7 @@
               <w14:ligatures w14:val="standardContextual"/>
             </w:rPr>
           </w:pPr>
-          <w:hyperlink w:anchor="_Toc240098586" w:history="1">
+          <w:hyperlink w:anchor="_Toc240098951" w:history="1">
             <w:r>
               <w:rPr>
                 <w:rStyle w:val="Hyperlink"/>
@@ -1064,7 +1064,7 @@
               <w:rPr>
                 <w:noProof/>
               </w:rPr>
-              <w:instrText xml:space="preserve"> PAGEREF _Toc240098586 \h </w:instrText>
+              <w:instrText xml:space="preserve"> PAGEREF _Toc240098951 \h </w:instrText>
             </w:r>
             <w:r>
               <w:rPr>
@@ -1107,7 +1107,7 @@
               <w14:ligatures w14:val="standardContextual"/>
             </w:rPr>
           </w:pPr>
-          <w:hyperlink w:anchor="_Toc240098587" w:history="1">
+          <w:hyperlink w:anchor="_Toc240098952" w:history="1">
             <w:r>
               <w:rPr>
                 <w:rStyle w:val="Hyperlink"/>
@@ -1131,7 +1131,7 @@
               <w:rPr>
                 <w:noProof/>
               </w:rPr>
-              <w:instrText xml:space="preserve"> PAGEREF _Toc240098587 \h </w:instrText>
+              <w:instrText xml:space="preserve"> PAGEREF _Toc240098952 \h </w:instrText>
             </w:r>
             <w:r>
               <w:rPr>
@@ -1149,6 +1149,274 @@
                 <w:noProof/>
               </w:rPr>
               <w:t>4</w:t>
+            </w:r>
+            <w:r>
+              <w:rPr>
+                <w:noProof/>
+              </w:rPr>
+              <w:fldChar w:fldCharType="end"/>
+            </w:r>
+          </w:hyperlink>
+        </w:p>
+        <w:p>
+          <w:pPr>
+            <w:pStyle w:val="TOC3"/>
+            <w:tabs>
+              <w:tab w:val="right" w:leader="dot" w:pos="9016"/>
+            </w:tabs>
+            <w:rPr>
+              <w:rFonts w:asciiTheme="minorHAnsi" w:eastAsiaTheme="minorEastAsia" w:hAnsiTheme="minorHAnsi" w:cstheme="minorBidi"/>
+              <w:noProof/>
+              <w:color w:val="auto"/>
+              <w:kern w:val="2"/>
+              <w:sz w:val="24"/>
+              <w:szCs w:val="24"/>
+              <w14:ligatures w14:val="standardContextual"/>
+            </w:rPr>
+          </w:pPr>
+          <w:hyperlink w:anchor="_Toc240098953" w:history="1">
+            <w:r>
+              <w:rPr>
+                <w:rStyle w:val="Hyperlink"/>
+                <w:noProof/>
+              </w:rPr>
+              <w:t>3.2.1. Kiến trúc mô hình</w:t>
+            </w:r>
+            <w:r>
+              <w:rPr>
+                <w:noProof/>
+              </w:rPr>
+              <w:tab/>
+            </w:r>
+            <w:r>
+              <w:rPr>
+                <w:noProof/>
+              </w:rPr>
+              <w:fldChar w:fldCharType="begin"/>
+            </w:r>
+            <w:r>
+              <w:rPr>
+                <w:noProof/>
+              </w:rPr>
+              <w:instrText xml:space="preserve"> PAGEREF _Toc240098953 \h </w:instrText>
+            </w:r>
+            <w:r>
+              <w:rPr>
+                <w:noProof/>
+              </w:rPr>
+            </w:r>
+            <w:r>
+              <w:rPr>
+                <w:noProof/>
+              </w:rPr>
+              <w:fldChar w:fldCharType="separate"/>
+            </w:r>
+            <w:r>
+              <w:rPr>
+                <w:noProof/>
+              </w:rPr>
+              <w:t>4</w:t>
+            </w:r>
+            <w:r>
+              <w:rPr>
+                <w:noProof/>
+              </w:rPr>
+              <w:fldChar w:fldCharType="end"/>
+            </w:r>
+          </w:hyperlink>
+        </w:p>
+        <w:p>
+          <w:pPr>
+            <w:pStyle w:val="TOC3"/>
+            <w:tabs>
+              <w:tab w:val="right" w:leader="dot" w:pos="9016"/>
+            </w:tabs>
+            <w:rPr>
+              <w:rFonts w:asciiTheme="minorHAnsi" w:eastAsiaTheme="minorEastAsia" w:hAnsiTheme="minorHAnsi" w:cstheme="minorBidi"/>
+              <w:noProof/>
+              <w:color w:val="auto"/>
+              <w:kern w:val="2"/>
+              <w:sz w:val="24"/>
+              <w:szCs w:val="24"/>
+              <w14:ligatures w14:val="standardContextual"/>
+            </w:rPr>
+          </w:pPr>
+          <w:hyperlink w:anchor="_Toc240098954" w:history="1">
+            <w:r>
+              <w:rPr>
+                <w:rStyle w:val="Hyperlink"/>
+                <w:noProof/>
+              </w:rPr>
+              <w:t>3.2.2. Huấn luyện cục bộ (local training)</w:t>
+            </w:r>
+            <w:r>
+              <w:rPr>
+                <w:noProof/>
+              </w:rPr>
+              <w:tab/>
+            </w:r>
+            <w:r>
+              <w:rPr>
+                <w:noProof/>
+              </w:rPr>
+              <w:fldChar w:fldCharType="begin"/>
+            </w:r>
+            <w:r>
+              <w:rPr>
+                <w:noProof/>
+              </w:rPr>
+              <w:instrText xml:space="preserve"> PAGEREF _Toc240098954 \h </w:instrText>
+            </w:r>
+            <w:r>
+              <w:rPr>
+                <w:noProof/>
+              </w:rPr>
+            </w:r>
+            <w:r>
+              <w:rPr>
+                <w:noProof/>
+              </w:rPr>
+              <w:fldChar w:fldCharType="separate"/>
+            </w:r>
+            <w:r>
+              <w:rPr>
+                <w:noProof/>
+              </w:rPr>
+              <w:t>4</w:t>
+            </w:r>
+            <w:r>
+              <w:rPr>
+                <w:noProof/>
+              </w:rPr>
+              <w:fldChar w:fldCharType="end"/>
+            </w:r>
+          </w:hyperlink>
+        </w:p>
+        <w:p>
+          <w:pPr>
+            <w:pStyle w:val="TOC3"/>
+            <w:tabs>
+              <w:tab w:val="right" w:leader="dot" w:pos="9016"/>
+            </w:tabs>
+            <w:rPr>
+              <w:rFonts w:asciiTheme="minorHAnsi" w:eastAsiaTheme="minorEastAsia" w:hAnsiTheme="minorHAnsi" w:cstheme="minorBidi"/>
+              <w:noProof/>
+              <w:color w:val="auto"/>
+              <w:kern w:val="2"/>
+              <w:sz w:val="24"/>
+              <w:szCs w:val="24"/>
+              <w14:ligatures w14:val="standardContextual"/>
+            </w:rPr>
+          </w:pPr>
+          <w:hyperlink w:anchor="_Toc240098955" w:history="1">
+            <w:r>
+              <w:rPr>
+                <w:rStyle w:val="Hyperlink"/>
+                <w:noProof/>
+              </w:rPr>
+              <w:t>3.2.3. Tổng hợp FedAvg</w:t>
+            </w:r>
+            <w:r>
+              <w:rPr>
+                <w:noProof/>
+              </w:rPr>
+              <w:tab/>
+            </w:r>
+            <w:r>
+              <w:rPr>
+                <w:noProof/>
+              </w:rPr>
+              <w:fldChar w:fldCharType="begin"/>
+            </w:r>
+            <w:r>
+              <w:rPr>
+                <w:noProof/>
+              </w:rPr>
+              <w:instrText xml:space="preserve"> PAGEREF _Toc240098955 \h </w:instrText>
+            </w:r>
+            <w:r>
+              <w:rPr>
+                <w:noProof/>
+              </w:rPr>
+            </w:r>
+            <w:r>
+              <w:rPr>
+                <w:noProof/>
+              </w:rPr>
+              <w:fldChar w:fldCharType="separate"/>
+            </w:r>
+            <w:r>
+              <w:rPr>
+                <w:noProof/>
+              </w:rPr>
+              <w:t>5</w:t>
+            </w:r>
+            <w:r>
+              <w:rPr>
+                <w:noProof/>
+              </w:rPr>
+              <w:fldChar w:fldCharType="end"/>
+            </w:r>
+          </w:hyperlink>
+        </w:p>
+        <w:p>
+          <w:pPr>
+            <w:pStyle w:val="TOC3"/>
+            <w:tabs>
+              <w:tab w:val="right" w:leader="dot" w:pos="9016"/>
+            </w:tabs>
+            <w:rPr>
+              <w:rFonts w:asciiTheme="minorHAnsi" w:eastAsiaTheme="minorEastAsia" w:hAnsiTheme="minorHAnsi" w:cstheme="minorBidi"/>
+              <w:noProof/>
+              <w:color w:val="auto"/>
+              <w:kern w:val="2"/>
+              <w:sz w:val="24"/>
+              <w:szCs w:val="24"/>
+              <w14:ligatures w14:val="standardContextual"/>
+            </w:rPr>
+          </w:pPr>
+          <w:hyperlink w:anchor="_Toc240098956" w:history="1">
+            <w:r>
+              <w:rPr>
+                <w:rStyle w:val="Hyperlink"/>
+                <w:noProof/>
+              </w:rPr>
+              <w:t>3.2.4. Vòng lặp huấn luyện và tiêu chí đánh giá</w:t>
+            </w:r>
+            <w:r>
+              <w:rPr>
+                <w:noProof/>
+              </w:rPr>
+              <w:tab/>
+            </w:r>
+            <w:r>
+              <w:rPr>
+                <w:noProof/>
+              </w:rPr>
+              <w:fldChar w:fldCharType="begin"/>
+            </w:r>
+            <w:r>
+              <w:rPr>
+                <w:noProof/>
+              </w:rPr>
+              <w:instrText xml:space="preserve"> PAGEREF _Toc240098956 \h </w:instrText>
+            </w:r>
+            <w:r>
+              <w:rPr>
+                <w:noProof/>
+              </w:rPr>
+            </w:r>
+            <w:r>
+              <w:rPr>
+                <w:noProof/>
+              </w:rPr>
+              <w:fldChar w:fldCharType="separate"/>
+            </w:r>
+            <w:r>
+              <w:rPr>
+                <w:noProof/>
+              </w:rPr>
+              <w:t>5</w:t>
             </w:r>
             <w:r>
               <w:rPr>
@@ -1174,7 +1442,7 @@
               <w14:ligatures w14:val="standardContextual"/>
             </w:rPr>
           </w:pPr>
-          <w:hyperlink w:anchor="_Toc240098588" w:history="1">
+          <w:hyperlink w:anchor="_Toc240098957" w:history="1">
             <w:r>
               <w:rPr>
                 <w:rStyle w:val="Hyperlink"/>
@@ -1198,7 +1466,7 @@
               <w:rPr>
                 <w:noProof/>
               </w:rPr>
-              <w:instrText xml:space="preserve"> PAGEREF _Toc240098588 \h </w:instrText>
+              <w:instrText xml:space="preserve"> PAGEREF _Toc240098957 \h </w:instrText>
             </w:r>
             <w:r>
               <w:rPr>
@@ -1215,7 +1483,7 @@
               <w:rPr>
                 <w:noProof/>
               </w:rPr>
-              <w:t>4</w:t>
+              <w:t>5</w:t>
             </w:r>
             <w:r>
               <w:rPr>
@@ -1241,7 +1509,7 @@
               <w14:ligatures w14:val="standardContextual"/>
             </w:rPr>
           </w:pPr>
-          <w:hyperlink w:anchor="_Toc240098589" w:history="1">
+          <w:hyperlink w:anchor="_Toc240098958" w:history="1">
             <w:r>
               <w:rPr>
                 <w:rStyle w:val="Hyperlink"/>
@@ -1265,7 +1533,7 @@
               <w:rPr>
                 <w:noProof/>
               </w:rPr>
-              <w:instrText xml:space="preserve"> PAGEREF _Toc240098589 \h </w:instrText>
+              <w:instrText xml:space="preserve"> PAGEREF _Toc240098958 \h </w:instrText>
             </w:r>
             <w:r>
               <w:rPr>
@@ -1282,7 +1550,7 @@
               <w:rPr>
                 <w:noProof/>
               </w:rPr>
-              <w:t>4</w:t>
+              <w:t>6</w:t>
             </w:r>
             <w:r>
               <w:rPr>
@@ -1308,7 +1576,7 @@
               <w14:ligatures w14:val="standardContextual"/>
             </w:rPr>
           </w:pPr>
-          <w:hyperlink w:anchor="_Toc240098590" w:history="1">
+          <w:hyperlink w:anchor="_Toc240098959" w:history="1">
             <w:r>
               <w:rPr>
                 <w:rStyle w:val="Hyperlink"/>
@@ -1332,7 +1600,7 @@
               <w:rPr>
                 <w:noProof/>
               </w:rPr>
-              <w:instrText xml:space="preserve"> PAGEREF _Toc240098590 \h </w:instrText>
+              <w:instrText xml:space="preserve"> PAGEREF _Toc240098959 \h </w:instrText>
             </w:r>
             <w:r>
               <w:rPr>
@@ -1349,7 +1617,7 @@
               <w:rPr>
                 <w:noProof/>
               </w:rPr>
-              <w:t>4</w:t>
+              <w:t>6</w:t>
             </w:r>
             <w:r>
               <w:rPr>
@@ -1375,7 +1643,7 @@
               <w14:ligatures w14:val="standardContextual"/>
             </w:rPr>
           </w:pPr>
-          <w:hyperlink w:anchor="_Toc240098591" w:history="1">
+          <w:hyperlink w:anchor="_Toc240098960" w:history="1">
             <w:r>
               <w:rPr>
                 <w:rStyle w:val="Hyperlink"/>
@@ -1399,7 +1667,7 @@
               <w:rPr>
                 <w:noProof/>
               </w:rPr>
-              <w:instrText xml:space="preserve"> PAGEREF _Toc240098591 \h </w:instrText>
+              <w:instrText xml:space="preserve"> PAGEREF _Toc240098960 \h </w:instrText>
             </w:r>
             <w:r>
               <w:rPr>
@@ -1416,7 +1684,7 @@
               <w:rPr>
                 <w:noProof/>
               </w:rPr>
-              <w:t>5</w:t>
+              <w:t>6</w:t>
             </w:r>
             <w:r>
               <w:rPr>
@@ -1442,7 +1710,7 @@
               <w14:ligatures w14:val="standardContextual"/>
             </w:rPr>
           </w:pPr>
-          <w:hyperlink w:anchor="_Toc240098592" w:history="1">
+          <w:hyperlink w:anchor="_Toc240098961" w:history="1">
             <w:r>
               <w:rPr>
                 <w:rStyle w:val="Hyperlink"/>
@@ -1466,7 +1734,7 @@
               <w:rPr>
                 <w:noProof/>
               </w:rPr>
-              <w:instrText xml:space="preserve"> PAGEREF _Toc240098592 \h </w:instrText>
+              <w:instrText xml:space="preserve"> PAGEREF _Toc240098961 \h </w:instrText>
             </w:r>
             <w:r>
               <w:rPr>
@@ -1483,7 +1751,7 @@
               <w:rPr>
                 <w:noProof/>
               </w:rPr>
-              <w:t>5</w:t>
+              <w:t>6</w:t>
             </w:r>
             <w:r>
               <w:rPr>
@@ -1509,7 +1777,7 @@
               <w14:ligatures w14:val="standardContextual"/>
             </w:rPr>
           </w:pPr>
-          <w:hyperlink w:anchor="_Toc240098593" w:history="1">
+          <w:hyperlink w:anchor="_Toc240098962" w:history="1">
             <w:r>
               <w:rPr>
                 <w:rStyle w:val="Hyperlink"/>
@@ -1533,7 +1801,7 @@
               <w:rPr>
                 <w:noProof/>
               </w:rPr>
-              <w:instrText xml:space="preserve"> PAGEREF _Toc240098593 \h </w:instrText>
+              <w:instrText xml:space="preserve"> PAGEREF _Toc240098962 \h </w:instrText>
             </w:r>
             <w:r>
               <w:rPr>
@@ -1550,7 +1818,7 @@
               <w:rPr>
                 <w:noProof/>
               </w:rPr>
-              <w:t>5</w:t>
+              <w:t>6</w:t>
             </w:r>
             <w:r>
               <w:rPr>
@@ -1576,7 +1844,7 @@
               <w14:ligatures w14:val="standardContextual"/>
             </w:rPr>
           </w:pPr>
-          <w:hyperlink w:anchor="_Toc240098594" w:history="1">
+          <w:hyperlink w:anchor="_Toc240098963" w:history="1">
             <w:r>
               <w:rPr>
                 <w:rStyle w:val="Hyperlink"/>
@@ -1600,7 +1868,7 @@
               <w:rPr>
                 <w:noProof/>
               </w:rPr>
-              <w:instrText xml:space="preserve"> PAGEREF _Toc240098594 \h </w:instrText>
+              <w:instrText xml:space="preserve"> PAGEREF _Toc240098963 \h </w:instrText>
             </w:r>
             <w:r>
               <w:rPr>
@@ -1617,7 +1885,7 @@
               <w:rPr>
                 <w:noProof/>
               </w:rPr>
-              <w:t>6</w:t>
+              <w:t>7</w:t>
             </w:r>
             <w:r>
               <w:rPr>
@@ -1643,7 +1911,7 @@
               <w14:ligatures w14:val="standardContextual"/>
             </w:rPr>
           </w:pPr>
-          <w:hyperlink w:anchor="_Toc240098595" w:history="1">
+          <w:hyperlink w:anchor="_Toc240098964" w:history="1">
             <w:r>
               <w:rPr>
                 <w:rStyle w:val="Hyperlink"/>
@@ -1667,7 +1935,7 @@
               <w:rPr>
                 <w:noProof/>
               </w:rPr>
-              <w:instrText xml:space="preserve"> PAGEREF _Toc240098595 \h </w:instrText>
+              <w:instrText xml:space="preserve"> PAGEREF _Toc240098964 \h </w:instrText>
             </w:r>
             <w:r>
               <w:rPr>
@@ -1684,7 +1952,7 @@
               <w:rPr>
                 <w:noProof/>
               </w:rPr>
-              <w:t>6</w:t>
+              <w:t>8</w:t>
             </w:r>
             <w:r>
               <w:rPr>
@@ -1710,7 +1978,7 @@
               <w14:ligatures w14:val="standardContextual"/>
             </w:rPr>
           </w:pPr>
-          <w:hyperlink w:anchor="_Toc240098596" w:history="1">
+          <w:hyperlink w:anchor="_Toc240098965" w:history="1">
             <w:r>
               <w:rPr>
                 <w:rStyle w:val="Hyperlink"/>
@@ -1734,7 +2002,7 @@
               <w:rPr>
                 <w:noProof/>
               </w:rPr>
-              <w:instrText xml:space="preserve"> PAGEREF _Toc240098596 \h </w:instrText>
+              <w:instrText xml:space="preserve"> PAGEREF _Toc240098965 \h </w:instrText>
             </w:r>
             <w:r>
               <w:rPr>
@@ -1751,7 +2019,7 @@
               <w:rPr>
                 <w:noProof/>
               </w:rPr>
-              <w:t>8</w:t>
+              <w:t>9</w:t>
             </w:r>
             <w:r>
               <w:rPr>
@@ -1777,7 +2045,7 @@
               <w14:ligatures w14:val="standardContextual"/>
             </w:rPr>
           </w:pPr>
-          <w:hyperlink w:anchor="_Toc240098597" w:history="1">
+          <w:hyperlink w:anchor="_Toc240098966" w:history="1">
             <w:r>
               <w:rPr>
                 <w:rStyle w:val="Hyperlink"/>
@@ -1801,7 +2069,7 @@
               <w:rPr>
                 <w:noProof/>
               </w:rPr>
-              <w:instrText xml:space="preserve"> PAGEREF _Toc240098597 \h </w:instrText>
+              <w:instrText xml:space="preserve"> PAGEREF _Toc240098966 \h </w:instrText>
             </w:r>
             <w:r>
               <w:rPr>
@@ -1818,7 +2086,7 @@
               <w:rPr>
                 <w:noProof/>
               </w:rPr>
-              <w:t>8</w:t>
+              <w:t>9</w:t>
             </w:r>
             <w:r>
               <w:rPr>
@@ -1844,7 +2112,7 @@
               <w14:ligatures w14:val="standardContextual"/>
             </w:rPr>
           </w:pPr>
-          <w:hyperlink w:anchor="_Toc240098598" w:history="1">
+          <w:hyperlink w:anchor="_Toc240098967" w:history="1">
             <w:r>
               <w:rPr>
                 <w:rStyle w:val="Hyperlink"/>
@@ -1868,7 +2136,7 @@
               <w:rPr>
                 <w:noProof/>
               </w:rPr>
-              <w:instrText xml:space="preserve"> PAGEREF _Toc240098598 \h </w:instrText>
+              <w:instrText xml:space="preserve"> PAGEREF _Toc240098967 \h </w:instrText>
             </w:r>
             <w:r>
               <w:rPr>
@@ -1885,7 +2153,7 @@
               <w:rPr>
                 <w:noProof/>
               </w:rPr>
-              <w:t>8</w:t>
+              <w:t>9</w:t>
             </w:r>
             <w:r>
               <w:rPr>
@@ -1911,7 +2179,7 @@
               <w14:ligatures w14:val="standardContextual"/>
             </w:rPr>
           </w:pPr>
-          <w:hyperlink w:anchor="_Toc240098599" w:history="1">
+          <w:hyperlink w:anchor="_Toc240098968" w:history="1">
             <w:r>
               <w:rPr>
                 <w:rStyle w:val="Hyperlink"/>
@@ -1935,7 +2203,7 @@
               <w:rPr>
                 <w:noProof/>
               </w:rPr>
-              <w:instrText xml:space="preserve"> PAGEREF _Toc240098599 \h </w:instrText>
+              <w:instrText xml:space="preserve"> PAGEREF _Toc240098968 \h </w:instrText>
             </w:r>
             <w:r>
               <w:rPr>
@@ -1952,7 +2220,7 @@
               <w:rPr>
                 <w:noProof/>
               </w:rPr>
-              <w:t>8</w:t>
+              <w:t>10</w:t>
             </w:r>
             <w:r>
               <w:rPr>
@@ -1978,7 +2246,7 @@
               <w14:ligatures w14:val="standardContextual"/>
             </w:rPr>
           </w:pPr>
-          <w:hyperlink w:anchor="_Toc240098600" w:history="1">
+          <w:hyperlink w:anchor="_Toc240098969" w:history="1">
             <w:r>
               <w:rPr>
                 <w:rStyle w:val="Hyperlink"/>
@@ -2002,7 +2270,7 @@
               <w:rPr>
                 <w:noProof/>
               </w:rPr>
-              <w:instrText xml:space="preserve"> PAGEREF _Toc240098600 \h </w:instrText>
+              <w:instrText xml:space="preserve"> PAGEREF _Toc240098969 \h </w:instrText>
             </w:r>
             <w:r>
               <w:rPr>
@@ -2019,7 +2287,7 @@
               <w:rPr>
                 <w:noProof/>
               </w:rPr>
-              <w:t>8</w:t>
+              <w:t>10</w:t>
             </w:r>
             <w:r>
               <w:rPr>
@@ -2045,7 +2313,7 @@
               <w14:ligatures w14:val="standardContextual"/>
             </w:rPr>
           </w:pPr>
-          <w:hyperlink w:anchor="_Toc240098601" w:history="1">
+          <w:hyperlink w:anchor="_Toc240098970" w:history="1">
             <w:r>
               <w:rPr>
                 <w:rStyle w:val="Hyperlink"/>
@@ -2069,7 +2337,7 @@
               <w:rPr>
                 <w:noProof/>
               </w:rPr>
-              <w:instrText xml:space="preserve"> PAGEREF _Toc240098601 \h </w:instrText>
+              <w:instrText xml:space="preserve"> PAGEREF _Toc240098970 \h </w:instrText>
             </w:r>
             <w:r>
               <w:rPr>
@@ -2086,7 +2354,7 @@
               <w:rPr>
                 <w:noProof/>
               </w:rPr>
-              <w:t>9</w:t>
+              <w:t>10</w:t>
             </w:r>
             <w:r>
               <w:rPr>
@@ -2112,7 +2380,7 @@
               <w14:ligatures w14:val="standardContextual"/>
             </w:rPr>
           </w:pPr>
-          <w:hyperlink w:anchor="_Toc240098602" w:history="1">
+          <w:hyperlink w:anchor="_Toc240098971" w:history="1">
             <w:r>
               <w:rPr>
                 <w:rStyle w:val="Hyperlink"/>
@@ -2136,7 +2404,7 @@
               <w:rPr>
                 <w:noProof/>
               </w:rPr>
-              <w:instrText xml:space="preserve"> PAGEREF _Toc240098602 \h </w:instrText>
+              <w:instrText xml:space="preserve"> PAGEREF _Toc240098971 \h </w:instrText>
             </w:r>
             <w:r>
               <w:rPr>
@@ -2153,7 +2421,7 @@
               <w:rPr>
                 <w:noProof/>
               </w:rPr>
-              <w:t>9</w:t>
+              <w:t>11</w:t>
             </w:r>
             <w:r>
               <w:rPr>
@@ -2192,7 +2460,7 @@
         <w:pStyle w:val="Heading1"/>
         <w:spacing w:before="320" w:after="160"/>
       </w:pPr>
-      <w:bookmarkStart w:id="1" w:name="_Toc240098581"/>
+      <w:bookmarkStart w:id="1" w:name="_Toc240098946"/>
       <w:r>
         <w:t>1. Giới thiệu</w:t>
       </w:r>
@@ -2203,7 +2471,7 @@
         <w:pStyle w:val="Heading2"/>
         <w:spacing w:before="240" w:after="120"/>
       </w:pPr>
-      <w:bookmarkStart w:id="2" w:name="_Toc240098582"/>
+      <w:bookmarkStart w:id="2" w:name="_Toc240098947"/>
       <w:r>
         <w:t>1.1. Bối cảnh và bài toán</w:t>
       </w:r>
@@ -2230,7 +2498,7 @@
         <w:pStyle w:val="Heading2"/>
         <w:spacing w:before="240" w:after="120"/>
       </w:pPr>
-      <w:bookmarkStart w:id="3" w:name="_Toc240098583"/>
+      <w:bookmarkStart w:id="3" w:name="_Toc240098948"/>
       <w:r>
         <w:t>1.2. Mục tiêu đồ án</w:t>
       </w:r>
@@ -2249,7 +2517,7 @@
         <w:pStyle w:val="Heading1"/>
         <w:spacing w:before="320" w:after="160"/>
       </w:pPr>
-      <w:bookmarkStart w:id="4" w:name="_Toc240098584"/>
+      <w:bookmarkStart w:id="4" w:name="_Toc240098949"/>
       <w:r>
         <w:t>2. Kiến trúc hệ thống tổng quan</w:t>
       </w:r>
@@ -2273,7 +2541,7 @@
           <w:noProof/>
         </w:rPr>
         <w:drawing>
-          <wp:inline distT="0" distB="0" distL="0" distR="0" wp14:anchorId="706B6809" wp14:editId="63830DD7">
+          <wp:inline distT="0" distB="0" distL="0" distR="0" wp14:anchorId="13620B76" wp14:editId="335E5D5F">
             <wp:extent cx="5334000" cy="2724150"/>
             <wp:effectExtent l="0" t="0" r="0" b="0"/>
             <wp:docPr id="1" name="Picture 1"/>
@@ -2418,7 +2686,7 @@
         <w:pStyle w:val="Heading1"/>
         <w:spacing w:before="320" w:after="160"/>
       </w:pPr>
-      <w:bookmarkStart w:id="5" w:name="_Toc240098585"/>
+      <w:bookmarkStart w:id="5" w:name="_Toc240098950"/>
       <w:r>
         <w:t>3. Thiết kế chi tiết từng tầng</w:t>
       </w:r>
@@ -2429,7 +2697,7 @@
         <w:pStyle w:val="Heading2"/>
         <w:spacing w:before="240" w:after="120"/>
       </w:pPr>
-      <w:bookmarkStart w:id="6" w:name="_Toc240098586"/>
+      <w:bookmarkStart w:id="6" w:name="_Toc240098951"/>
       <w:r>
         <w:t>3.1. Tầng IoT (Edge Node)</w:t>
       </w:r>
@@ -2458,7 +2726,7 @@
           <w:left w:w="10" w:type="dxa"/>
           <w:right w:w="10" w:type="dxa"/>
         </w:tblCellMar>
-        <w:tblLook w:val="04A0" w:firstRow="1" w:lastRow="0" w:firstColumn="1" w:lastColumn="0" w:noHBand="0" w:noVBand="1"/>
+        <w:tblLook w:val="0000" w:firstRow="0" w:lastRow="0" w:firstColumn="0" w:lastColumn="0" w:noHBand="0" w:noVBand="0"/>
       </w:tblPr>
       <w:tblGrid>
         <w:gridCol w:w="941"/>
@@ -3066,73 +3334,76 @@
         <w:pStyle w:val="Heading2"/>
         <w:spacing w:before="240" w:after="120"/>
       </w:pPr>
-      <w:bookmarkStart w:id="7" w:name="_Toc240098587"/>
+      <w:bookmarkStart w:id="7" w:name="_Toc240098952"/>
       <w:r>
         <w:t>3.2. Tầng AI (Federated Learning)</w:t>
       </w:r>
       <w:bookmarkEnd w:id="7"/>
-    </w:p>
-    <w:p>
-      <w:pPr>
-        <w:spacing w:after="160"/>
-      </w:pPr>
-      <w:r>
-        <w:t>Mô hình: mạng nơ-ron MLP 2 lớp ẩn (16 nơ-ron/lớp, kích hoạt ReLU), đầu vào 5 đặc trưng, đầu ra 2 lớp (bình thường/bất thường). Thuật toán tổng hợp là FedAvg (Federated Averaging – McMahan et al., 2017):</w:t>
-      </w:r>
-    </w:p>
-    <w:p>
-      <w:pPr>
-        <w:spacing w:after="160"/>
-        <w:jc w:val="center"/>
-      </w:pPr>
-      <w:r>
-        <w:t>w_global = Σ (n_i / N) × w_i,  với n_i là số mẫu của node i, N = Σ n_i</w:t>
-      </w:r>
-    </w:p>
-    <w:p>
-      <w:pPr>
-        <w:spacing w:after="160"/>
-      </w:pPr>
-      <w:r>
-        <w:t>Mỗi round: global weights được broadcast xuống từng node → node huấn luyện cục bộ 5 epoch bằng SGD (learning rate 0.05) → gửi Δw về → tính trung bình có trọng số theo số mẫu → cập nhật Global Model. Độ chính xác được đánh giá trên tập test gộp của tất cả node sau mỗi round để theo dõi hội tụ.</w:t>
-      </w:r>
-    </w:p>
-    <w:p>
-      <w:pPr>
-        <w:pStyle w:val="Heading2"/>
-        <w:spacing w:before="240" w:after="120"/>
-      </w:pPr>
-      <w:bookmarkStart w:id="8" w:name="_Toc240098588"/>
-      <w:r>
-        <w:t>3.3. Tầng Blockchain (Smart Contract)</w:t>
-      </w:r>
-      <w:bookmarkEnd w:id="8"/>
-    </w:p>
-    <w:p>
-      <w:pPr>
-        <w:spacing w:after="160"/>
-      </w:pPr>
-      <w:r>
-        <w:t>Ngôn ngữ Solidity 0.8.24, phát triển và kiểm thử trên Hardhat local network. Hai smart contract:</w:t>
-      </w:r>
     </w:p>
     <w:p>
       <w:pPr>
         <w:pStyle w:val="Heading3"/>
         <w:spacing w:before="180" w:after="100"/>
       </w:pPr>
-      <w:bookmarkStart w:id="9" w:name="_Toc240098589"/>
-      <w:r>
-        <w:t>3.3.1. BlockFLToken.sol — token ERC-20 thưởng</w:t>
-      </w:r>
-      <w:bookmarkEnd w:id="9"/>
+      <w:bookmarkStart w:id="8" w:name="_Toc240098953"/>
+      <w:r>
+        <w:t>3.2.1. Kiến trúc mô hình</w:t>
+      </w:r>
+      <w:bookmarkEnd w:id="8"/>
     </w:p>
     <w:p>
       <w:pPr>
         <w:spacing w:after="160"/>
       </w:pPr>
       <w:r>
-        <w:t>Token BFL tối giản, tuân thủ chuẩn ERC-20 (transfer, approve, transferFrom). Chỉ địa chỉ minter (được set là FederatedAggregator sau khi deploy) mới được phép mint — chống việc chủ hợp đồng tự phát token cho mình.</w:t>
+        <w:t>Bài toán đặt ra là phân loại nhị phân (bình thường / bất thường) trên 5 đặc trưng số dạng bảng (heart_rate, spo2, body_temp, hr_var, motion) — không phải ảnh hay chuỗi thời gian dài, nên không cần đến CNN hay RNN/LSTM vốn nặng và khó hội tụ nhanh trong phạm vi vài round FedAvg. Nhóm chọn mạng nơ-ron truyền thẳng (MLP — VitalsMLP trong ai_model/model.py) gồm:</w:t>
+      </w:r>
+    </w:p>
+    <w:p>
+      <w:pPr>
+        <w:pStyle w:val="ListParagraph"/>
+        <w:numPr>
+          <w:ilvl w:val="0"/>
+          <w:numId w:val="1"/>
+        </w:numPr>
+        <w:spacing w:after="80"/>
+      </w:pPr>
+      <w:r>
+        <w:t>Lớp vào: 5 nơ-ron, tương ứng 5 đặc trưng cảm biến đã chuẩn hoá (z-score theo thống kê của tập train từng node).</w:t>
+      </w:r>
+    </w:p>
+    <w:p>
+      <w:pPr>
+        <w:pStyle w:val="ListParagraph"/>
+        <w:numPr>
+          <w:ilvl w:val="0"/>
+          <w:numId w:val="1"/>
+        </w:numPr>
+        <w:spacing w:after="80"/>
+      </w:pPr>
+      <w:r>
+        <w:t>2 lớp ẩn, mỗi lớp 16 nơ-ron, kích hoạt ReLU — đủ biểu diễn ranh giới phi tuyến giữa 2 lớp mà không dư thừa tham số (tổng cộng chỉ ~450 tham số/mô hình).</w:t>
+      </w:r>
+    </w:p>
+    <w:p>
+      <w:pPr>
+        <w:pStyle w:val="ListParagraph"/>
+        <w:numPr>
+          <w:ilvl w:val="0"/>
+          <w:numId w:val="1"/>
+        </w:numPr>
+        <w:spacing w:after="80"/>
+      </w:pPr>
+      <w:r>
+        <w:t>Lớp ra: 2 nơ-ron (logit cho 2 lớp), kết hợp hàm mất mát CrossEntropyLoss (tương đương softmax + negative log-likelihood).</w:t>
+      </w:r>
+    </w:p>
+    <w:p>
+      <w:pPr>
+        <w:spacing w:after="160"/>
+      </w:pPr>
+      <w:r>
+        <w:t>Chọn mô hình nhỏ là chủ đích: (1) FedAvg cần vài chục round là hội tụ trong giới hạn thời gian đồ án; (2) tham số càng ít thì Δw truyền giữa node và server (off-chain) càng nhẹ, phù hợp mô phỏng cho thiết bị biên tài nguyên hạn chế; (3) dễ debug và trực quan hoá kết quả khi thuyết trình.</w:t>
       </w:r>
     </w:p>
     <w:p>
@@ -3140,11 +3411,19 @@
         <w:pStyle w:val="Heading3"/>
         <w:spacing w:before="180" w:after="100"/>
       </w:pPr>
-      <w:bookmarkStart w:id="10" w:name="_Toc240098590"/>
-      <w:r>
-        <w:t>3.3.2. FederatedAggregator.sol — điều phối round FL</w:t>
-      </w:r>
-      <w:bookmarkEnd w:id="10"/>
+      <w:bookmarkStart w:id="9" w:name="_Toc240098954"/>
+      <w:r>
+        <w:t>3.2.2. Huấn luyện cục bộ (local training)</w:t>
+      </w:r>
+      <w:bookmarkEnd w:id="9"/>
+    </w:p>
+    <w:p>
+      <w:pPr>
+        <w:spacing w:after="160"/>
+      </w:pPr>
+      <w:r>
+        <w:t>Ở mỗi round, mỗi node nhận global weights, khởi tạo lại mô hình với đúng bộ trọng số đó (không huấn luyện lại từ đầu), rồi huấn luyện tiếp trên dữ liệu riêng của mình với cấu hình:</w:t>
+      </w:r>
     </w:p>
     <w:tbl>
       <w:tblPr>
@@ -3161,7 +3440,610 @@
           <w:left w:w="10" w:type="dxa"/>
           <w:right w:w="10" w:type="dxa"/>
         </w:tblCellMar>
-        <w:tblLook w:val="04A0" w:firstRow="1" w:lastRow="0" w:firstColumn="1" w:lastColumn="0" w:noHBand="0" w:noVBand="1"/>
+        <w:tblLook w:val="0000" w:firstRow="0" w:lastRow="0" w:firstColumn="0" w:lastColumn="0" w:noHBand="0" w:noVBand="0"/>
+      </w:tblPr>
+      <w:tblGrid>
+        <w:gridCol w:w="1311"/>
+        <w:gridCol w:w="2138"/>
+        <w:gridCol w:w="5901"/>
+      </w:tblGrid>
+      <w:tr>
+        <w:tblPrEx>
+          <w:tblCellMar>
+            <w:top w:w="0" w:type="dxa"/>
+            <w:bottom w:w="0" w:type="dxa"/>
+          </w:tblCellMar>
+        </w:tblPrEx>
+        <w:trPr>
+          <w:tblHeader/>
+        </w:trPr>
+        <w:tc>
+          <w:tcPr>
+            <w:tcW w:w="0" w:type="auto"/>
+            <w:shd w:val="clear" w:color="auto" w:fill="E7EEE7"/>
+            <w:tcMar>
+              <w:top w:w="80" w:type="dxa"/>
+              <w:left w:w="100" w:type="dxa"/>
+              <w:bottom w:w="80" w:type="dxa"/>
+              <w:right w:w="100" w:type="dxa"/>
+            </w:tcMar>
+          </w:tcPr>
+          <w:p>
+            <w:r>
+              <w:rPr>
+                <w:b/>
+                <w:bCs/>
+              </w:rPr>
+              <w:t>Siêu tham số</w:t>
+            </w:r>
+          </w:p>
+        </w:tc>
+        <w:tc>
+          <w:tcPr>
+            <w:tcW w:w="0" w:type="auto"/>
+            <w:shd w:val="clear" w:color="auto" w:fill="E7EEE7"/>
+            <w:tcMar>
+              <w:top w:w="80" w:type="dxa"/>
+              <w:left w:w="100" w:type="dxa"/>
+              <w:bottom w:w="80" w:type="dxa"/>
+              <w:right w:w="100" w:type="dxa"/>
+            </w:tcMar>
+          </w:tcPr>
+          <w:p>
+            <w:r>
+              <w:rPr>
+                <w:b/>
+                <w:bCs/>
+              </w:rPr>
+              <w:t>Giá trị</w:t>
+            </w:r>
+          </w:p>
+        </w:tc>
+        <w:tc>
+          <w:tcPr>
+            <w:tcW w:w="0" w:type="auto"/>
+            <w:shd w:val="clear" w:color="auto" w:fill="E7EEE7"/>
+            <w:tcMar>
+              <w:top w:w="80" w:type="dxa"/>
+              <w:left w:w="100" w:type="dxa"/>
+              <w:bottom w:w="80" w:type="dxa"/>
+              <w:right w:w="100" w:type="dxa"/>
+            </w:tcMar>
+          </w:tcPr>
+          <w:p>
+            <w:r>
+              <w:rPr>
+                <w:b/>
+                <w:bCs/>
+              </w:rPr>
+              <w:t>Vai trò</w:t>
+            </w:r>
+          </w:p>
+        </w:tc>
+      </w:tr>
+      <w:tr>
+        <w:tblPrEx>
+          <w:tblCellMar>
+            <w:top w:w="0" w:type="dxa"/>
+            <w:bottom w:w="0" w:type="dxa"/>
+          </w:tblCellMar>
+        </w:tblPrEx>
+        <w:tc>
+          <w:tcPr>
+            <w:tcW w:w="0" w:type="auto"/>
+            <w:tcMar>
+              <w:top w:w="80" w:type="dxa"/>
+              <w:left w:w="100" w:type="dxa"/>
+              <w:bottom w:w="80" w:type="dxa"/>
+              <w:right w:w="100" w:type="dxa"/>
+            </w:tcMar>
+            <w:vAlign w:val="center"/>
+          </w:tcPr>
+          <w:p>
+            <w:r>
+              <w:t>Optimizer</w:t>
+            </w:r>
+          </w:p>
+        </w:tc>
+        <w:tc>
+          <w:tcPr>
+            <w:tcW w:w="0" w:type="auto"/>
+            <w:tcMar>
+              <w:top w:w="80" w:type="dxa"/>
+              <w:left w:w="100" w:type="dxa"/>
+              <w:bottom w:w="80" w:type="dxa"/>
+              <w:right w:w="100" w:type="dxa"/>
+            </w:tcMar>
+            <w:vAlign w:val="center"/>
+          </w:tcPr>
+          <w:p>
+            <w:r>
+              <w:t>SGD, momentum = 0.9</w:t>
+            </w:r>
+          </w:p>
+        </w:tc>
+        <w:tc>
+          <w:tcPr>
+            <w:tcW w:w="0" w:type="auto"/>
+            <w:tcMar>
+              <w:top w:w="80" w:type="dxa"/>
+              <w:left w:w="100" w:type="dxa"/>
+              <w:bottom w:w="80" w:type="dxa"/>
+              <w:right w:w="100" w:type="dxa"/>
+            </w:tcMar>
+            <w:vAlign w:val="center"/>
+          </w:tcPr>
+          <w:p>
+            <w:r>
+              <w:t>Momentum giúp hội tụ nhanh hơn SGD thuần trên tập dữ liệu nhỏ mỗi node</w:t>
+            </w:r>
+          </w:p>
+        </w:tc>
+      </w:tr>
+      <w:tr>
+        <w:tblPrEx>
+          <w:tblCellMar>
+            <w:top w:w="0" w:type="dxa"/>
+            <w:bottom w:w="0" w:type="dxa"/>
+          </w:tblCellMar>
+        </w:tblPrEx>
+        <w:tc>
+          <w:tcPr>
+            <w:tcW w:w="0" w:type="auto"/>
+            <w:tcMar>
+              <w:top w:w="80" w:type="dxa"/>
+              <w:left w:w="100" w:type="dxa"/>
+              <w:bottom w:w="80" w:type="dxa"/>
+              <w:right w:w="100" w:type="dxa"/>
+            </w:tcMar>
+            <w:vAlign w:val="center"/>
+          </w:tcPr>
+          <w:p>
+            <w:r>
+              <w:t>Learning rate</w:t>
+            </w:r>
+          </w:p>
+        </w:tc>
+        <w:tc>
+          <w:tcPr>
+            <w:tcW w:w="0" w:type="auto"/>
+            <w:tcMar>
+              <w:top w:w="80" w:type="dxa"/>
+              <w:left w:w="100" w:type="dxa"/>
+              <w:bottom w:w="80" w:type="dxa"/>
+              <w:right w:w="100" w:type="dxa"/>
+            </w:tcMar>
+            <w:vAlign w:val="center"/>
+          </w:tcPr>
+          <w:p>
+            <w:r>
+              <w:t>0.05</w:t>
+            </w:r>
+          </w:p>
+        </w:tc>
+        <w:tc>
+          <w:tcPr>
+            <w:tcW w:w="0" w:type="auto"/>
+            <w:tcMar>
+              <w:top w:w="80" w:type="dxa"/>
+              <w:left w:w="100" w:type="dxa"/>
+              <w:bottom w:w="80" w:type="dxa"/>
+              <w:right w:w="100" w:type="dxa"/>
+            </w:tcMar>
+            <w:vAlign w:val="center"/>
+          </w:tcPr>
+          <w:p>
+            <w:r>
+              <w:t>Đủ lớn để hội tụ trong 5 epoch, nhưng không quá lớn gây dao động Δw giữa các node</w:t>
+            </w:r>
+          </w:p>
+        </w:tc>
+      </w:tr>
+      <w:tr>
+        <w:tblPrEx>
+          <w:tblCellMar>
+            <w:top w:w="0" w:type="dxa"/>
+            <w:bottom w:w="0" w:type="dxa"/>
+          </w:tblCellMar>
+        </w:tblPrEx>
+        <w:tc>
+          <w:tcPr>
+            <w:tcW w:w="0" w:type="auto"/>
+            <w:tcMar>
+              <w:top w:w="80" w:type="dxa"/>
+              <w:left w:w="100" w:type="dxa"/>
+              <w:bottom w:w="80" w:type="dxa"/>
+              <w:right w:w="100" w:type="dxa"/>
+            </w:tcMar>
+            <w:vAlign w:val="center"/>
+          </w:tcPr>
+          <w:p>
+            <w:r>
+              <w:t>Epoch cục bộ</w:t>
+            </w:r>
+          </w:p>
+        </w:tc>
+        <w:tc>
+          <w:tcPr>
+            <w:tcW w:w="0" w:type="auto"/>
+            <w:tcMar>
+              <w:top w:w="80" w:type="dxa"/>
+              <w:left w:w="100" w:type="dxa"/>
+              <w:bottom w:w="80" w:type="dxa"/>
+              <w:right w:w="100" w:type="dxa"/>
+            </w:tcMar>
+            <w:vAlign w:val="center"/>
+          </w:tcPr>
+          <w:p>
+            <w:r>
+              <w:t>5</w:t>
+            </w:r>
+          </w:p>
+        </w:tc>
+        <w:tc>
+          <w:tcPr>
+            <w:tcW w:w="0" w:type="auto"/>
+            <w:tcMar>
+              <w:top w:w="80" w:type="dxa"/>
+              <w:left w:w="100" w:type="dxa"/>
+              <w:bottom w:w="80" w:type="dxa"/>
+              <w:right w:w="100" w:type="dxa"/>
+            </w:tcMar>
+            <w:vAlign w:val="center"/>
+          </w:tcPr>
+          <w:p>
+            <w:r>
+              <w:t>Cân bằng giữa hội tụ cục bộ tốt và tránh overfit lên dữ liệu non-IID của riêng node</w:t>
+            </w:r>
+          </w:p>
+        </w:tc>
+      </w:tr>
+      <w:tr>
+        <w:tblPrEx>
+          <w:tblCellMar>
+            <w:top w:w="0" w:type="dxa"/>
+            <w:bottom w:w="0" w:type="dxa"/>
+          </w:tblCellMar>
+        </w:tblPrEx>
+        <w:tc>
+          <w:tcPr>
+            <w:tcW w:w="0" w:type="auto"/>
+            <w:tcMar>
+              <w:top w:w="80" w:type="dxa"/>
+              <w:left w:w="100" w:type="dxa"/>
+              <w:bottom w:w="80" w:type="dxa"/>
+              <w:right w:w="100" w:type="dxa"/>
+            </w:tcMar>
+            <w:vAlign w:val="center"/>
+          </w:tcPr>
+          <w:p>
+            <w:r>
+              <w:t>Batch size</w:t>
+            </w:r>
+          </w:p>
+        </w:tc>
+        <w:tc>
+          <w:tcPr>
+            <w:tcW w:w="0" w:type="auto"/>
+            <w:tcMar>
+              <w:top w:w="80" w:type="dxa"/>
+              <w:left w:w="100" w:type="dxa"/>
+              <w:bottom w:w="80" w:type="dxa"/>
+              <w:right w:w="100" w:type="dxa"/>
+            </w:tcMar>
+            <w:vAlign w:val="center"/>
+          </w:tcPr>
+          <w:p>
+            <w:r>
+              <w:t>32</w:t>
+            </w:r>
+          </w:p>
+        </w:tc>
+        <w:tc>
+          <w:tcPr>
+            <w:tcW w:w="0" w:type="auto"/>
+            <w:tcMar>
+              <w:top w:w="80" w:type="dxa"/>
+              <w:left w:w="100" w:type="dxa"/>
+              <w:bottom w:w="80" w:type="dxa"/>
+              <w:right w:w="100" w:type="dxa"/>
+            </w:tcMar>
+            <w:vAlign w:val="center"/>
+          </w:tcPr>
+          <w:p>
+            <w:r>
+              <w:t>Phù hợp với quy mô dữ liệu mỗi node (153–290 mẫu train)</w:t>
+            </w:r>
+          </w:p>
+        </w:tc>
+      </w:tr>
+      <w:tr>
+        <w:tblPrEx>
+          <w:tblCellMar>
+            <w:top w:w="0" w:type="dxa"/>
+            <w:bottom w:w="0" w:type="dxa"/>
+          </w:tblCellMar>
+        </w:tblPrEx>
+        <w:tc>
+          <w:tcPr>
+            <w:tcW w:w="0" w:type="auto"/>
+            <w:tcMar>
+              <w:top w:w="80" w:type="dxa"/>
+              <w:left w:w="100" w:type="dxa"/>
+              <w:bottom w:w="80" w:type="dxa"/>
+              <w:right w:w="100" w:type="dxa"/>
+            </w:tcMar>
+            <w:vAlign w:val="center"/>
+          </w:tcPr>
+          <w:p>
+            <w:r>
+              <w:t>Hàm mất mát</w:t>
+            </w:r>
+          </w:p>
+        </w:tc>
+        <w:tc>
+          <w:tcPr>
+            <w:tcW w:w="0" w:type="auto"/>
+            <w:tcMar>
+              <w:top w:w="80" w:type="dxa"/>
+              <w:left w:w="100" w:type="dxa"/>
+              <w:bottom w:w="80" w:type="dxa"/>
+              <w:right w:w="100" w:type="dxa"/>
+            </w:tcMar>
+            <w:vAlign w:val="center"/>
+          </w:tcPr>
+          <w:p>
+            <w:r>
+              <w:t>CrossEntropyLoss</w:t>
+            </w:r>
+          </w:p>
+        </w:tc>
+        <w:tc>
+          <w:tcPr>
+            <w:tcW w:w="0" w:type="auto"/>
+            <w:tcMar>
+              <w:top w:w="80" w:type="dxa"/>
+              <w:left w:w="100" w:type="dxa"/>
+              <w:bottom w:w="80" w:type="dxa"/>
+              <w:right w:w="100" w:type="dxa"/>
+            </w:tcMar>
+            <w:vAlign w:val="center"/>
+          </w:tcPr>
+          <w:p>
+            <w:r>
+              <w:t>Chuẩn cho bài toán phân loại đa lớp (ở đây là 2 lớp)</w:t>
+            </w:r>
+          </w:p>
+        </w:tc>
+      </w:tr>
+    </w:tbl>
+    <w:p>
+      <w:pPr>
+        <w:spacing w:after="160"/>
+      </w:pPr>
+      <w:r>
+        <w:t>Sau khi huấn luyện xong, node chỉ gửi đi bộ trọng số mới (Δw dưới dạng vector phẳng, ghép từ toàn bộ tham số của mô hình) chứ không gửi gradient hay dữ liệu — đây chính là ranh giới bảo mật cốt lõi của Federated Learning.</w:t>
+      </w:r>
+    </w:p>
+    <w:p>
+      <w:pPr>
+        <w:pStyle w:val="Heading3"/>
+        <w:spacing w:before="180" w:after="100"/>
+      </w:pPr>
+      <w:bookmarkStart w:id="10" w:name="_Toc240098955"/>
+      <w:r>
+        <w:t>3.2.3. Tổng hợp FedAvg</w:t>
+      </w:r>
+      <w:bookmarkEnd w:id="10"/>
+    </w:p>
+    <w:p>
+      <w:pPr>
+        <w:spacing w:after="160"/>
+      </w:pPr>
+      <w:r>
+        <w:t>Thuật toán tổng hợp là FedAvg (Federated Averaging – McMahan et al., 2017), ý tưởng cốt lõi là lấy trung bình có trọng số các bộ tham số cục bộ, trọng số tỉ lệ với số mẫu mỗi node đóng góp:</w:t>
+      </w:r>
+    </w:p>
+    <w:p>
+      <w:pPr>
+        <w:spacing w:after="160"/>
+        <w:jc w:val="center"/>
+      </w:pPr>
+      <w:r>
+        <w:t>w_global = Σ (n_i / N) × w_i,  với n_i là số mẫu của node i, N = Σ n_i</w:t>
+      </w:r>
+    </w:p>
+    <w:p>
+      <w:pPr>
+        <w:spacing w:after="160"/>
+      </w:pPr>
+      <w:r>
+        <w:t>Cách chia trọng số theo n_i (thay vì chia đều 1/số node) đảm bảo công bằng thống kê: node có nhiều dữ liệu hơn (ví dụ node 1 với 368 mẫu) sẽ có ảnh hưởng lớn hơn tới mô hình chung so với node ít dữ liệu (node 0 với 226 mẫu) — đúng tinh thần "đóng góp nhiều, ảnh hưởng nhiều", đồng thời cũng là căn cứ để tầng Blockchain tính token thưởng theo đúng công thức tương tự (mục 3.3.2).</w:t>
+      </w:r>
+    </w:p>
+    <w:p>
+      <w:pPr>
+        <w:spacing w:after="160"/>
+      </w:pPr>
+      <w:r>
+        <w:t>Việc tính trung bình được thực hiện off-chain (trong ai_model/fedavg.py) vì: chi phí gas để nhân/cộng hàng trăm số thực dấu phẩy động ngay trên EVM là không cần thiết và tốn kém; EVM cũng không có kiểu dữ liệu số thực gốc. Sau khi tính xong, toàn bộ vector trọng số mới được băm bằng keccak256 thành 32 byte duy nhất, và chỉ giá trị hash này được ghi lên smart contract qua hàm aggregate() — chuỗi đóng vai trò trọng tài xác nhận "phiên bản nào là bản chính thức", không đóng vai trò máy tính.</w:t>
+      </w:r>
+    </w:p>
+    <w:p>
+      <w:pPr>
+        <w:pStyle w:val="Heading3"/>
+        <w:spacing w:before="180" w:after="100"/>
+      </w:pPr>
+      <w:bookmarkStart w:id="11" w:name="_Toc240098956"/>
+      <w:r>
+        <w:t>3.2.4. Vòng lặp huấn luyện và tiêu chí đánh giá</w:t>
+      </w:r>
+      <w:bookmarkEnd w:id="11"/>
+    </w:p>
+    <w:p>
+      <w:pPr>
+        <w:pStyle w:val="ListParagraph"/>
+        <w:numPr>
+          <w:ilvl w:val="0"/>
+          <w:numId w:val="1"/>
+        </w:numPr>
+        <w:spacing w:after="80"/>
+      </w:pPr>
+      <w:r>
+        <w:t>Bước 1 — Khởi tạo: Global Model khởi tạo ngẫu nhiên (round 0), dùng làm baseline so sánh.</w:t>
+      </w:r>
+    </w:p>
+    <w:p>
+      <w:pPr>
+        <w:pStyle w:val="ListParagraph"/>
+        <w:numPr>
+          <w:ilvl w:val="0"/>
+          <w:numId w:val="1"/>
+        </w:numPr>
+        <w:spacing w:after="80"/>
+      </w:pPr>
+      <w:r>
+        <w:t>Bước 2 — Broadcast: global weights hiện tại được gửi (giả lập, gọi hàm trực tiếp trong run_demo.py) xuống toàn bộ 4 node.</w:t>
+      </w:r>
+    </w:p>
+    <w:p>
+      <w:pPr>
+        <w:pStyle w:val="ListParagraph"/>
+        <w:numPr>
+          <w:ilvl w:val="0"/>
+          <w:numId w:val="1"/>
+        </w:numPr>
+        <w:spacing w:after="80"/>
+      </w:pPr>
+      <w:r>
+        <w:t>Bước 3 — Local training: mỗi node huấn luyện độc lập theo cấu hình ở mục 3.2.2.</w:t>
+      </w:r>
+    </w:p>
+    <w:p>
+      <w:pPr>
+        <w:pStyle w:val="ListParagraph"/>
+        <w:numPr>
+          <w:ilvl w:val="0"/>
+          <w:numId w:val="1"/>
+        </w:numPr>
+        <w:spacing w:after="80"/>
+      </w:pPr>
+      <w:r>
+        <w:t>Bước 4 — Submit: node băm Δw và gọi submitWeights() lên smart contract kèm số mẫu n_i.</w:t>
+      </w:r>
+    </w:p>
+    <w:p>
+      <w:pPr>
+        <w:pStyle w:val="ListParagraph"/>
+        <w:numPr>
+          <w:ilvl w:val="0"/>
+          <w:numId w:val="1"/>
+        </w:numPr>
+        <w:spacing w:after="80"/>
+      </w:pPr>
+      <w:r>
+        <w:t>Bước 5 — Aggregate: khi đủ 4/4 node đã nộp (minNodes = 3, có thể chốt sớm hơn), chạy FedAvg off-chain, ghi hash lên chain.</w:t>
+      </w:r>
+    </w:p>
+    <w:p>
+      <w:pPr>
+        <w:pStyle w:val="ListParagraph"/>
+        <w:numPr>
+          <w:ilvl w:val="0"/>
+          <w:numId w:val="1"/>
+        </w:numPr>
+        <w:spacing w:after="80"/>
+      </w:pPr>
+      <w:r>
+        <w:t>Bước 6 — Đánh giá: Global Model mới được chấm lại trên tập test gộp của toàn bộ 4 node (chưa từng thấy trong huấn luyện) để đo accuracy, F1 (lớp bất thường) và loss — đây chính là 3 chỉ số dùng để vẽ đường hội tụ ở Hình 2.</w:t>
+      </w:r>
+    </w:p>
+    <w:p>
+      <w:pPr>
+        <w:pStyle w:val="ListParagraph"/>
+        <w:numPr>
+          <w:ilvl w:val="0"/>
+          <w:numId w:val="1"/>
+        </w:numPr>
+        <w:spacing w:after="80"/>
+      </w:pPr>
+      <w:r>
+        <w:t>Bước 7 — Thưởng &amp; lặp: hợp đồng phân phối token BFL theo tỉ lệ n_i, sau đó mở round tiếp theo (advanceRound()), quay lại Bước 2.</w:t>
+      </w:r>
+    </w:p>
+    <w:p>
+      <w:pPr>
+        <w:spacing w:after="160"/>
+      </w:pPr>
+      <w:r>
+        <w:t>Việc luôn đánh giá trên tập test gộp (không phải tập train) ở mọi round là điều kiện bắt buộc để đường cong ở Hình 2 phản ánh đúng khả năng tổng quát hoá của mô hình, chứ không phải hiện tượng học thuộc lòng dữ liệu cục bộ. Đây cũng là cơ sở cho phép so sánh trực tiếp accuracy của Global Model với accuracy của từng node tự huấn luyện riêng lẻ ở mục 5.2 — vì cả hai đều được chấm trên chính xác cùng một tập test.</w:t>
+      </w:r>
+    </w:p>
+    <w:p>
+      <w:pPr>
+        <w:pStyle w:val="Heading2"/>
+        <w:spacing w:before="240" w:after="120"/>
+      </w:pPr>
+      <w:bookmarkStart w:id="12" w:name="_Toc240098957"/>
+      <w:r>
+        <w:t>3.3. Tầng Blockchain (Smart Contract)</w:t>
+      </w:r>
+      <w:bookmarkEnd w:id="12"/>
+    </w:p>
+    <w:p>
+      <w:pPr>
+        <w:spacing w:after="160"/>
+      </w:pPr>
+      <w:r>
+        <w:t>Ngôn ngữ Solidity 0.8.24, phát triển và kiểm thử trên Hardhat local network. Hai smart contract:</w:t>
+      </w:r>
+    </w:p>
+    <w:p>
+      <w:pPr>
+        <w:pStyle w:val="Heading3"/>
+        <w:spacing w:before="180" w:after="100"/>
+      </w:pPr>
+      <w:bookmarkStart w:id="13" w:name="_Toc240098958"/>
+      <w:r>
+        <w:t>3.3.1. BlockFLToken.sol — token ERC-20 thưởng</w:t>
+      </w:r>
+      <w:bookmarkEnd w:id="13"/>
+    </w:p>
+    <w:p>
+      <w:pPr>
+        <w:spacing w:after="160"/>
+      </w:pPr>
+      <w:r>
+        <w:t>Token BFL tối giản, tuân thủ chuẩn ERC-20 (transfer, approve, transferFrom). Chỉ địa chỉ minter (được set là FederatedAggregator sau khi deploy) mới được phép mint — chống việc chủ hợp đồng tự phát token cho mình.</w:t>
+      </w:r>
+    </w:p>
+    <w:p>
+      <w:pPr>
+        <w:pStyle w:val="Heading3"/>
+        <w:spacing w:before="180" w:after="100"/>
+      </w:pPr>
+      <w:bookmarkStart w:id="14" w:name="_Toc240098959"/>
+      <w:r>
+        <w:t>3.3.2. FederatedAggregator.sol — điều phối round FL</w:t>
+      </w:r>
+      <w:bookmarkEnd w:id="14"/>
+    </w:p>
+    <w:tbl>
+      <w:tblPr>
+        <w:tblW w:w="9350" w:type="dxa"/>
+        <w:tblBorders>
+          <w:top w:val="single" w:sz="4" w:space="0" w:color="auto"/>
+          <w:left w:val="single" w:sz="4" w:space="0" w:color="auto"/>
+          <w:bottom w:val="single" w:sz="4" w:space="0" w:color="auto"/>
+          <w:right w:val="single" w:sz="4" w:space="0" w:color="auto"/>
+          <w:insideH w:val="single" w:sz="4" w:space="0" w:color="auto"/>
+          <w:insideV w:val="single" w:sz="4" w:space="0" w:color="auto"/>
+        </w:tblBorders>
+        <w:tblCellMar>
+          <w:left w:w="10" w:type="dxa"/>
+          <w:right w:w="10" w:type="dxa"/>
+        </w:tblCellMar>
+        <w:tblLook w:val="0000" w:firstRow="0" w:lastRow="0" w:firstColumn="0" w:lastColumn="0" w:noHBand="0" w:noVBand="0"/>
       </w:tblPr>
       <w:tblGrid>
         <w:gridCol w:w="2916"/>
@@ -3566,11 +4448,11 @@
         <w:pStyle w:val="Heading1"/>
         <w:spacing w:before="320" w:after="160"/>
       </w:pPr>
-      <w:bookmarkStart w:id="11" w:name="_Toc240098591"/>
+      <w:bookmarkStart w:id="15" w:name="_Toc240098960"/>
       <w:r>
         <w:t>4. Công nghệ sử dụng</w:t>
       </w:r>
-      <w:bookmarkEnd w:id="11"/>
+      <w:bookmarkEnd w:id="15"/>
     </w:p>
     <w:tbl>
       <w:tblPr>
@@ -3587,7 +4469,7 @@
           <w:left w:w="10" w:type="dxa"/>
           <w:right w:w="10" w:type="dxa"/>
         </w:tblCellMar>
-        <w:tblLook w:val="04A0" w:firstRow="1" w:lastRow="0" w:firstColumn="1" w:lastColumn="0" w:noHBand="0" w:noVBand="1"/>
+        <w:tblLook w:val="0000" w:firstRow="0" w:lastRow="0" w:firstColumn="0" w:lastColumn="0" w:noHBand="0" w:noVBand="0"/>
       </w:tblPr>
       <w:tblGrid>
         <w:gridCol w:w="3061"/>
@@ -3946,22 +4828,22 @@
         <w:pStyle w:val="Heading1"/>
         <w:spacing w:before="320" w:after="160"/>
       </w:pPr>
-      <w:bookmarkStart w:id="12" w:name="_Toc240098592"/>
+      <w:bookmarkStart w:id="16" w:name="_Toc240098961"/>
       <w:r>
         <w:t>5. Kết quả thực nghiệm</w:t>
       </w:r>
-      <w:bookmarkEnd w:id="12"/>
+      <w:bookmarkEnd w:id="16"/>
     </w:p>
     <w:p>
       <w:pPr>
         <w:pStyle w:val="Heading2"/>
         <w:spacing w:before="240" w:after="120"/>
       </w:pPr>
-      <w:bookmarkStart w:id="13" w:name="_Toc240098593"/>
+      <w:bookmarkStart w:id="17" w:name="_Toc240098962"/>
       <w:r>
         <w:t>5.1. Hội tụ của Global Model qua từng round</w:t>
       </w:r>
-      <w:bookmarkEnd w:id="13"/>
+      <w:bookmarkEnd w:id="17"/>
     </w:p>
     <w:p>
       <w:pPr>
@@ -3981,10 +4863,10 @@
           <w:noProof/>
         </w:rPr>
         <w:drawing>
-          <wp:inline distT="0" distB="0" distL="0" distR="0" wp14:anchorId="35B6D297" wp14:editId="41B9AA65">
+          <wp:inline distT="0" distB="0" distL="0" distR="0" wp14:anchorId="4630E57F" wp14:editId="5CE106C3">
             <wp:extent cx="4572000" cy="2571750"/>
             <wp:effectExtent l="0" t="0" r="0" b="0"/>
-            <wp:docPr id="1887776319" name="Picture 1887776319"/>
+            <wp:docPr id="1604654460" name="Picture 1604654460"/>
             <wp:cNvGraphicFramePr>
               <a:graphicFrameLocks xmlns:a="http://schemas.openxmlformats.org/drawingml/2006/main" noChangeAspect="1"/>
             </wp:cNvGraphicFramePr>
@@ -4050,7 +4932,7 @@
           <w:left w:w="10" w:type="dxa"/>
           <w:right w:w="10" w:type="dxa"/>
         </w:tblCellMar>
-        <w:tblLook w:val="04A0" w:firstRow="1" w:lastRow="0" w:firstColumn="1" w:lastColumn="0" w:noHBand="0" w:noVBand="1"/>
+        <w:tblLook w:val="0000" w:firstRow="0" w:lastRow="0" w:firstColumn="0" w:lastColumn="0" w:noHBand="0" w:noVBand="0"/>
       </w:tblPr>
       <w:tblGrid>
         <w:gridCol w:w="1931"/>
@@ -4754,11 +5636,11 @@
         <w:pStyle w:val="Heading2"/>
         <w:spacing w:before="240" w:after="120"/>
       </w:pPr>
-      <w:bookmarkStart w:id="14" w:name="_Toc240098594"/>
+      <w:bookmarkStart w:id="18" w:name="_Toc240098963"/>
       <w:r>
         <w:t>5.2. So sánh FedAvg với từng node tự huấn luyện riêng lẻ</w:t>
       </w:r>
-      <w:bookmarkEnd w:id="14"/>
+      <w:bookmarkEnd w:id="18"/>
     </w:p>
     <w:p>
       <w:pPr>
@@ -4778,10 +5660,10 @@
           <w:noProof/>
         </w:rPr>
         <w:drawing>
-          <wp:inline distT="0" distB="0" distL="0" distR="0" wp14:anchorId="0ACABFBC" wp14:editId="1F2A3703">
+          <wp:inline distT="0" distB="0" distL="0" distR="0" wp14:anchorId="3FCD4793" wp14:editId="413F98FC">
             <wp:extent cx="4572000" cy="2571750"/>
             <wp:effectExtent l="0" t="0" r="0" b="0"/>
-            <wp:docPr id="1042911469" name="Picture 1042911469"/>
+            <wp:docPr id="369612156" name="Picture 369612156"/>
             <wp:cNvGraphicFramePr>
               <a:graphicFrameLocks xmlns:a="http://schemas.openxmlformats.org/drawingml/2006/main" noChangeAspect="1"/>
             </wp:cNvGraphicFramePr>
@@ -4847,7 +5729,7 @@
           <w:left w:w="10" w:type="dxa"/>
           <w:right w:w="10" w:type="dxa"/>
         </w:tblCellMar>
-        <w:tblLook w:val="04A0" w:firstRow="1" w:lastRow="0" w:firstColumn="1" w:lastColumn="0" w:noHBand="0" w:noVBand="1"/>
+        <w:tblLook w:val="0000" w:firstRow="0" w:lastRow="0" w:firstColumn="0" w:lastColumn="0" w:noHBand="0" w:noVBand="0"/>
       </w:tblPr>
       <w:tblGrid>
         <w:gridCol w:w="776"/>
@@ -5275,11 +6157,11 @@
         <w:pStyle w:val="Heading2"/>
         <w:spacing w:before="240" w:after="120"/>
       </w:pPr>
-      <w:bookmarkStart w:id="15" w:name="_Toc240098595"/>
+      <w:bookmarkStart w:id="19" w:name="_Toc240098964"/>
       <w:r>
         <w:t>5.3. Kiểm định độ ổn định qua nhiều lần chia dữ liệu</w:t>
       </w:r>
-      <w:bookmarkEnd w:id="15"/>
+      <w:bookmarkEnd w:id="19"/>
     </w:p>
     <w:p>
       <w:pPr>
@@ -5299,10 +6181,10 @@
           <w:noProof/>
         </w:rPr>
         <w:drawing>
-          <wp:inline distT="0" distB="0" distL="0" distR="0" wp14:anchorId="318D2BE8" wp14:editId="0FDA3781">
+          <wp:inline distT="0" distB="0" distL="0" distR="0" wp14:anchorId="3FDCD96F" wp14:editId="168E41A8">
             <wp:extent cx="4572000" cy="2571750"/>
             <wp:effectExtent l="0" t="0" r="0" b="0"/>
-            <wp:docPr id="541433696" name="Picture 541433696"/>
+            <wp:docPr id="1365081449" name="Picture 1365081449"/>
             <wp:cNvGraphicFramePr>
               <a:graphicFrameLocks xmlns:a="http://schemas.openxmlformats.org/drawingml/2006/main" noChangeAspect="1"/>
             </wp:cNvGraphicFramePr>
@@ -5368,7 +6250,7 @@
           <w:left w:w="10" w:type="dxa"/>
           <w:right w:w="10" w:type="dxa"/>
         </w:tblCellMar>
-        <w:tblLook w:val="04A0" w:firstRow="1" w:lastRow="0" w:firstColumn="1" w:lastColumn="0" w:noHBand="0" w:noVBand="1"/>
+        <w:tblLook w:val="0000" w:firstRow="0" w:lastRow="0" w:firstColumn="0" w:lastColumn="0" w:noHBand="0" w:noVBand="0"/>
       </w:tblPr>
       <w:tblGrid>
         <w:gridCol w:w="6004"/>
@@ -5668,7 +6550,7 @@
           <w:left w:w="10" w:type="dxa"/>
           <w:right w:w="10" w:type="dxa"/>
         </w:tblCellMar>
-        <w:tblLook w:val="04A0" w:firstRow="1" w:lastRow="0" w:firstColumn="1" w:lastColumn="0" w:noHBand="0" w:noVBand="1"/>
+        <w:tblLook w:val="0000" w:firstRow="0" w:lastRow="0" w:firstColumn="0" w:lastColumn="0" w:noHBand="0" w:noVBand="0"/>
       </w:tblPr>
       <w:tblGrid>
         <w:gridCol w:w="656"/>
@@ -6936,11 +7818,11 @@
         <w:pStyle w:val="Heading2"/>
         <w:spacing w:before="240" w:after="120"/>
       </w:pPr>
-      <w:bookmarkStart w:id="16" w:name="_Toc240098596"/>
+      <w:bookmarkStart w:id="20" w:name="_Toc240098965"/>
       <w:r>
         <w:t>5.4. Kiểm thử smart contract</w:t>
       </w:r>
-      <w:bookmarkEnd w:id="16"/>
+      <w:bookmarkEnd w:id="20"/>
     </w:p>
     <w:p>
       <w:pPr>
@@ -6955,11 +7837,11 @@
         <w:pStyle w:val="Heading2"/>
         <w:spacing w:before="240" w:after="120"/>
       </w:pPr>
-      <w:bookmarkStart w:id="17" w:name="_Toc240098597"/>
+      <w:bookmarkStart w:id="21" w:name="_Toc240098966"/>
       <w:r>
         <w:t>5.5. Minh bạch và chống chối bỏ trên chuỗi</w:t>
       </w:r>
-      <w:bookmarkEnd w:id="17"/>
+      <w:bookmarkEnd w:id="21"/>
     </w:p>
     <w:p>
       <w:pPr>
@@ -6974,11 +7856,11 @@
         <w:pStyle w:val="Heading1"/>
         <w:spacing w:before="320" w:after="160"/>
       </w:pPr>
-      <w:bookmarkStart w:id="18" w:name="_Toc240098598"/>
+      <w:bookmarkStart w:id="22" w:name="_Toc240098967"/>
       <w:r>
         <w:t>6. Đánh giá rủi ro và phương án xử lý</w:t>
       </w:r>
-      <w:bookmarkEnd w:id="18"/>
+      <w:bookmarkEnd w:id="22"/>
     </w:p>
     <w:tbl>
       <w:tblPr>
@@ -6995,7 +7877,7 @@
           <w:left w:w="10" w:type="dxa"/>
           <w:right w:w="10" w:type="dxa"/>
         </w:tblCellMar>
-        <w:tblLook w:val="04A0" w:firstRow="1" w:lastRow="0" w:firstColumn="1" w:lastColumn="0" w:noHBand="0" w:noVBand="1"/>
+        <w:tblLook w:val="0000" w:firstRow="0" w:lastRow="0" w:firstColumn="0" w:lastColumn="0" w:noHBand="0" w:noVBand="0"/>
       </w:tblPr>
       <w:tblGrid>
         <w:gridCol w:w="3090"/>
@@ -7270,11 +8152,11 @@
         <w:pStyle w:val="Heading1"/>
         <w:spacing w:before="320" w:after="160"/>
       </w:pPr>
-      <w:bookmarkStart w:id="19" w:name="_Toc240098599"/>
+      <w:bookmarkStart w:id="23" w:name="_Toc240098968"/>
       <w:r>
         <w:t>7. Kết luận và hướng phát triển</w:t>
       </w:r>
-      <w:bookmarkEnd w:id="19"/>
+      <w:bookmarkEnd w:id="23"/>
     </w:p>
     <w:p>
       <w:pPr>
@@ -7349,11 +8231,11 @@
         <w:pStyle w:val="Heading1"/>
         <w:spacing w:before="320" w:after="160"/>
       </w:pPr>
-      <w:bookmarkStart w:id="20" w:name="_Toc240098600"/>
+      <w:bookmarkStart w:id="24" w:name="_Toc240098969"/>
       <w:r>
         <w:t>8. Cấu trúc repository GitHub</w:t>
       </w:r>
-      <w:bookmarkEnd w:id="20"/>
+      <w:bookmarkEnd w:id="24"/>
     </w:p>
     <w:p>
       <w:pPr>
@@ -7480,11 +8362,11 @@
         <w:pStyle w:val="Heading1"/>
         <w:spacing w:before="320" w:after="160"/>
       </w:pPr>
-      <w:bookmarkStart w:id="21" w:name="_Toc240098601"/>
+      <w:bookmarkStart w:id="25" w:name="_Toc240098970"/>
       <w:r>
         <w:t>9. Phân công nhiệm vụ</w:t>
       </w:r>
-      <w:bookmarkEnd w:id="21"/>
+      <w:bookmarkEnd w:id="25"/>
     </w:p>
     <w:p>
       <w:pPr>
@@ -7509,7 +8391,7 @@
           <w:left w:w="10" w:type="dxa"/>
           <w:right w:w="10" w:type="dxa"/>
         </w:tblCellMar>
-        <w:tblLook w:val="04A0" w:firstRow="1" w:lastRow="0" w:firstColumn="1" w:lastColumn="0" w:noHBand="0" w:noVBand="1"/>
+        <w:tblLook w:val="0000" w:firstRow="0" w:lastRow="0" w:firstColumn="0" w:lastColumn="0" w:noHBand="0" w:noVBand="0"/>
       </w:tblPr>
       <w:tblGrid>
         <w:gridCol w:w="2936"/>
@@ -7784,11 +8666,11 @@
         <w:pStyle w:val="Heading1"/>
         <w:spacing w:before="320" w:after="160"/>
       </w:pPr>
-      <w:bookmarkStart w:id="22" w:name="_Toc240098602"/>
+      <w:bookmarkStart w:id="26" w:name="_Toc240098971"/>
       <w:r>
         <w:t>10. Tài liệu tham khảo</w:t>
       </w:r>
-      <w:bookmarkEnd w:id="22"/>
+      <w:bookmarkEnd w:id="26"/>
     </w:p>
     <w:p>
       <w:pPr>
@@ -7990,10 +8872,10 @@
 <file path=word/numbering.xml><?xml version="1.0" encoding="utf-8"?>
 <w:numbering xmlns:wpc="http://schemas.microsoft.com/office/word/2010/wordprocessingCanvas" xmlns:cx="http://schemas.microsoft.com/office/drawing/2014/chartex" xmlns:cx1="http://schemas.microsoft.com/office/drawing/2015/9/8/chartex" xmlns:cx2="http://schemas.microsoft.com/office/drawing/2015/10/21/chartex" xmlns:cx3="http://schemas.microsoft.com/office/drawing/2016/5/9/chartex" xmlns:cx4="http://schemas.microsoft.com/office/drawing/2016/5/10/chartex" xmlns:cx5="http://schemas.microsoft.com/office/drawing/2016/5/11/chartex" xmlns:cx6="http://schemas.microsoft.com/office/drawing/2016/5/12/chartex" xmlns:cx7="http://schemas.microsoft.com/office/drawing/2016/5/13/chartex" xmlns:cx8="http://schemas.microsoft.com/office/drawing/2016/5/14/chartex" xmlns:mc="http://schemas.openxmlformats.org/markup-compatibility/2006" xmlns:aink="http://schemas.microsoft.com/office/drawing/2016/ink" xmlns:am3d="http://schemas.microsoft.com/office/drawing/2017/model3d" xmlns:o="urn:schemas-microsoft-com:office:office" xmlns:oel="http://schemas.microsoft.com/office/2019/extlst" xmlns:r="http://schemas.openxmlformats.org/officeDocument/2006/relationships" xmlns:m="http://schemas.openxmlformats.org/officeDocument/2006/math" xmlns:v="urn:schemas-microsoft-com:vml" xmlns:wp14="http://schemas.microsoft.com/office/word/2010/wordprocessingDrawing" xmlns:wp="http://schemas.openxmlformats.org/drawingml/2006/wordprocessingDrawing" xmlns:w10="urn:schemas-microsoft-com:office:word" xmlns:w="http://schemas.openxmlformats.org/wordprocessingml/2006/main" xmlns:w14="http://schemas.microsoft.com/office/word/2010/wordml" xmlns:w15="http://schemas.microsoft.com/office/word/2012/wordml" xmlns:w16cex="http://schemas.microsoft.com/office/word/2018/wordml/cex" xmlns:w16cid="http://schemas.microsoft.com/office/word/2016/wordml/cid" xmlns:w16="http://schemas.microsoft.com/office/word/2018/wordml" xmlns:w16du="http://schemas.microsoft.com/office/word/2023/wordml/word16du" xmlns:w16sdtdh="http://schemas.microsoft.com/office/word/2020/wordml/sdtdatahash" xmlns:w16sdtfl="http://schemas.microsoft.com/office/word/2024/wordml/sdtformatlock" xmlns:w16se="http://schemas.microsoft.com/office/word/2015/wordml/symex" xmlns:wpg="http://schemas.microsoft.com/office/word/2010/wordprocessingGroup" xmlns:wpi="http://schemas.microsoft.com/office/word/2010/wordprocessingInk" xmlns:wne="http://schemas.microsoft.com/office/word/2006/wordml" xmlns:wps="http://schemas.microsoft.com/office/word/2010/wordprocessingShape" mc:Ignorable="w14 w15 w16se w16cid w16 w16cex w16sdtdh w16sdtfl w16du wp14">
   <w:abstractNum w:abstractNumId="0" w15:restartNumberingAfterBreak="0">
-    <w:nsid w:val="22A257CD"/>
+    <w:nsid w:val="15AF1183"/>
     <w:multiLevelType w:val="hybridMultilevel"/>
-    <w:tmpl w:val="E4CE6506"/>
-    <w:lvl w:ilvl="0" w:tplc="F078C854">
+    <w:tmpl w:val="7E5AAE42"/>
+    <w:lvl w:ilvl="0" w:tplc="A6B294C0">
       <w:start w:val="1"/>
       <w:numFmt w:val="bullet"/>
       <w:lvlText w:val="●"/>
@@ -8002,7 +8884,7 @@
         <w:ind w:left="720" w:hanging="360"/>
       </w:pPr>
     </w:lvl>
-    <w:lvl w:ilvl="1" w:tplc="E1A2A43E">
+    <w:lvl w:ilvl="1" w:tplc="0CD6EE18">
       <w:start w:val="1"/>
       <w:numFmt w:val="bullet"/>
       <w:lvlText w:val="○"/>
@@ -8011,7 +8893,7 @@
         <w:ind w:left="1440" w:hanging="360"/>
       </w:pPr>
     </w:lvl>
-    <w:lvl w:ilvl="2" w:tplc="6F64AE1C">
+    <w:lvl w:ilvl="2" w:tplc="B6B6FF32">
       <w:start w:val="1"/>
       <w:numFmt w:val="bullet"/>
       <w:lvlText w:val="■"/>
@@ -8020,7 +8902,7 @@
         <w:ind w:left="2160" w:hanging="360"/>
       </w:pPr>
     </w:lvl>
-    <w:lvl w:ilvl="3" w:tplc="F170E0E4">
+    <w:lvl w:ilvl="3" w:tplc="A66C072A">
       <w:start w:val="1"/>
       <w:numFmt w:val="bullet"/>
       <w:lvlText w:val="●"/>
@@ -8029,7 +8911,7 @@
         <w:ind w:left="2880" w:hanging="360"/>
       </w:pPr>
     </w:lvl>
-    <w:lvl w:ilvl="4" w:tplc="1F28A5C0">
+    <w:lvl w:ilvl="4" w:tplc="24B80DAA">
       <w:start w:val="1"/>
       <w:numFmt w:val="bullet"/>
       <w:lvlText w:val="○"/>
@@ -8038,7 +8920,7 @@
         <w:ind w:left="3600" w:hanging="360"/>
       </w:pPr>
     </w:lvl>
-    <w:lvl w:ilvl="5" w:tplc="2DC41C80">
+    <w:lvl w:ilvl="5" w:tplc="B4B03B44">
       <w:start w:val="1"/>
       <w:numFmt w:val="bullet"/>
       <w:lvlText w:val="■"/>
@@ -8047,7 +8929,7 @@
         <w:ind w:left="4320" w:hanging="360"/>
       </w:pPr>
     </w:lvl>
-    <w:lvl w:ilvl="6" w:tplc="D5EAF44E">
+    <w:lvl w:ilvl="6" w:tplc="FCEC8B14">
       <w:start w:val="1"/>
       <w:numFmt w:val="bullet"/>
       <w:lvlText w:val="●"/>
@@ -8056,7 +8938,7 @@
         <w:ind w:left="5040" w:hanging="360"/>
       </w:pPr>
     </w:lvl>
-    <w:lvl w:ilvl="7" w:tplc="E9D06D18">
+    <w:lvl w:ilvl="7" w:tplc="EF309E6E">
       <w:start w:val="1"/>
       <w:numFmt w:val="bullet"/>
       <w:lvlText w:val="●"/>
@@ -8065,7 +8947,7 @@
         <w:ind w:left="5760" w:hanging="360"/>
       </w:pPr>
     </w:lvl>
-    <w:lvl w:ilvl="8" w:tplc="D000259C">
+    <w:lvl w:ilvl="8" w:tplc="929279CE">
       <w:start w:val="1"/>
       <w:numFmt w:val="bullet"/>
       <w:lvlText w:val="●"/>
@@ -8075,7 +8957,7 @@
       </w:pPr>
     </w:lvl>
   </w:abstractNum>
-  <w:num w:numId="1" w16cid:durableId="398749868">
+  <w:num w:numId="1" w16cid:durableId="1571378308">
     <w:abstractNumId w:val="0"/>
     <w:lvlOverride w:ilvl="0">
       <w:startOverride w:val="1"/>
@@ -8691,7 +9573,7 @@
     <w:autoRedefine/>
     <w:uiPriority w:val="39"/>
     <w:unhideWhenUsed/>
-    <w:rsid w:val="00DF6F32"/>
+    <w:rsid w:val="007C346C"/>
     <w:pPr>
       <w:spacing w:after="100"/>
     </w:pPr>
@@ -8703,7 +9585,7 @@
     <w:autoRedefine/>
     <w:uiPriority w:val="39"/>
     <w:unhideWhenUsed/>
-    <w:rsid w:val="00DF6F32"/>
+    <w:rsid w:val="007C346C"/>
     <w:pPr>
       <w:spacing w:after="100"/>
       <w:ind w:left="220"/>
@@ -8716,7 +9598,7 @@
     <w:autoRedefine/>
     <w:uiPriority w:val="39"/>
     <w:unhideWhenUsed/>
-    <w:rsid w:val="00DF6F32"/>
+    <w:rsid w:val="007C346C"/>
     <w:pPr>
       <w:spacing w:after="100"/>
       <w:ind w:left="440"/>

</xml_diff>

<commit_message>
Sua 2 diem chua khop voi yeu cau cua thay: commit file trong so AI, dien link GitHub that vao bao cao
- .gitignore: bo ai_model/weights/ khoi danh sach loai tru - tai lieu
  huong dan ghi ro thu muc ai_model/ phai co ca ma nguon huan luyen
  LAN file trong so mo hinh AI, truoc gio file .npy bi gitignore nen
  khong len GitHub
- Them 5 file global_round_1..5.npy (24KB, trong so that cua lan chay
  chinh) vao repo
- scripts/build_report.js: dien link GitHub that
  (https://github.com/minhchien2329/BlockFL) thay cho placeholder o
  trang bia va muc 8
- Report_NhomXX.docx/.pdf: sinh lai voi link GitHub that
</commit_message>
<xml_diff>
--- a/Report_NhomXX.docx
+++ b/Report_NhomXX.docx
@@ -161,7 +161,7 @@
         <w:t xml:space="preserve">Mã nguồn: </w:t>
       </w:r>
       <w:r>
-        <w:t>[Điền link GitHub repository]</w:t>
+        <w:t>https://github.com/minhchien2329/BlockFL</w:t>
       </w:r>
     </w:p>
     <w:p>
@@ -189,7 +189,7 @@
           <w:left w:w="10" w:type="dxa"/>
           <w:right w:w="10" w:type="dxa"/>
         </w:tblCellMar>
-        <w:tblLook w:val="0000" w:firstRow="0" w:lastRow="0" w:firstColumn="0" w:lastColumn="0" w:noHBand="0" w:noVBand="0"/>
+        <w:tblLook w:val="04A0" w:firstRow="1" w:lastRow="0" w:firstColumn="1" w:lastColumn="0" w:noHBand="0" w:noVBand="1"/>
       </w:tblPr>
       <w:tblGrid>
         <w:gridCol w:w="995"/>
@@ -600,7 +600,7 @@
         <w:pStyle w:val="Heading1"/>
         <w:spacing w:before="320" w:after="160"/>
       </w:pPr>
-      <w:bookmarkStart w:id="0" w:name="_Toc240098945"/>
+      <w:bookmarkStart w:id="0" w:name="_Toc240271097"/>
       <w:r>
         <w:t>Mục lục</w:t>
       </w:r>
@@ -609,7 +609,7 @@
     <w:sdt>
       <w:sdtPr>
         <w:alias w:val="Mục lục"/>
-        <w:id w:val="1993058239"/>
+        <w:id w:val="1171295067"/>
       </w:sdtPr>
       <w:sdtEndPr/>
       <w:sdtContent>
@@ -638,7 +638,7 @@
           <w:r>
             <w:fldChar w:fldCharType="separate"/>
           </w:r>
-          <w:hyperlink w:anchor="_Toc240098945" w:history="1">
+          <w:hyperlink w:anchor="_Toc240271097" w:history="1">
             <w:r>
               <w:rPr>
                 <w:rStyle w:val="Hyperlink"/>
@@ -662,7 +662,7 @@
               <w:rPr>
                 <w:noProof/>
               </w:rPr>
-              <w:instrText xml:space="preserve"> PAGEREF _Toc240098945 \h </w:instrText>
+              <w:instrText xml:space="preserve"> PAGEREF _Toc240271097 \h </w:instrText>
             </w:r>
             <w:r>
               <w:rPr>
@@ -705,7 +705,7 @@
               <w14:ligatures w14:val="standardContextual"/>
             </w:rPr>
           </w:pPr>
-          <w:hyperlink w:anchor="_Toc240098946" w:history="1">
+          <w:hyperlink w:anchor="_Toc240271098" w:history="1">
             <w:r>
               <w:rPr>
                 <w:rStyle w:val="Hyperlink"/>
@@ -729,7 +729,7 @@
               <w:rPr>
                 <w:noProof/>
               </w:rPr>
-              <w:instrText xml:space="preserve"> PAGEREF _Toc240098946 \h </w:instrText>
+              <w:instrText xml:space="preserve"> PAGEREF _Toc240271098 \h </w:instrText>
             </w:r>
             <w:r>
               <w:rPr>
@@ -772,7 +772,7 @@
               <w14:ligatures w14:val="standardContextual"/>
             </w:rPr>
           </w:pPr>
-          <w:hyperlink w:anchor="_Toc240098947" w:history="1">
+          <w:hyperlink w:anchor="_Toc240271099" w:history="1">
             <w:r>
               <w:rPr>
                 <w:rStyle w:val="Hyperlink"/>
@@ -796,7 +796,7 @@
               <w:rPr>
                 <w:noProof/>
               </w:rPr>
-              <w:instrText xml:space="preserve"> PAGEREF _Toc240098947 \h </w:instrText>
+              <w:instrText xml:space="preserve"> PAGEREF _Toc240271099 \h </w:instrText>
             </w:r>
             <w:r>
               <w:rPr>
@@ -839,7 +839,7 @@
               <w14:ligatures w14:val="standardContextual"/>
             </w:rPr>
           </w:pPr>
-          <w:hyperlink w:anchor="_Toc240098948" w:history="1">
+          <w:hyperlink w:anchor="_Toc240271100" w:history="1">
             <w:r>
               <w:rPr>
                 <w:rStyle w:val="Hyperlink"/>
@@ -863,7 +863,7 @@
               <w:rPr>
                 <w:noProof/>
               </w:rPr>
-              <w:instrText xml:space="preserve"> PAGEREF _Toc240098948 \h </w:instrText>
+              <w:instrText xml:space="preserve"> PAGEREF _Toc240271100 \h </w:instrText>
             </w:r>
             <w:r>
               <w:rPr>
@@ -906,7 +906,7 @@
               <w14:ligatures w14:val="standardContextual"/>
             </w:rPr>
           </w:pPr>
-          <w:hyperlink w:anchor="_Toc240098949" w:history="1">
+          <w:hyperlink w:anchor="_Toc240271101" w:history="1">
             <w:r>
               <w:rPr>
                 <w:rStyle w:val="Hyperlink"/>
@@ -930,7 +930,7 @@
               <w:rPr>
                 <w:noProof/>
               </w:rPr>
-              <w:instrText xml:space="preserve"> PAGEREF _Toc240098949 \h </w:instrText>
+              <w:instrText xml:space="preserve"> PAGEREF _Toc240271101 \h </w:instrText>
             </w:r>
             <w:r>
               <w:rPr>
@@ -973,7 +973,7 @@
               <w14:ligatures w14:val="standardContextual"/>
             </w:rPr>
           </w:pPr>
-          <w:hyperlink w:anchor="_Toc240098950" w:history="1">
+          <w:hyperlink w:anchor="_Toc240271102" w:history="1">
             <w:r>
               <w:rPr>
                 <w:rStyle w:val="Hyperlink"/>
@@ -997,7 +997,7 @@
               <w:rPr>
                 <w:noProof/>
               </w:rPr>
-              <w:instrText xml:space="preserve"> PAGEREF _Toc240098950 \h </w:instrText>
+              <w:instrText xml:space="preserve"> PAGEREF _Toc240271102 \h </w:instrText>
             </w:r>
             <w:r>
               <w:rPr>
@@ -1040,7 +1040,7 @@
               <w14:ligatures w14:val="standardContextual"/>
             </w:rPr>
           </w:pPr>
-          <w:hyperlink w:anchor="_Toc240098951" w:history="1">
+          <w:hyperlink w:anchor="_Toc240271103" w:history="1">
             <w:r>
               <w:rPr>
                 <w:rStyle w:val="Hyperlink"/>
@@ -1064,7 +1064,7 @@
               <w:rPr>
                 <w:noProof/>
               </w:rPr>
-              <w:instrText xml:space="preserve"> PAGEREF _Toc240098951 \h </w:instrText>
+              <w:instrText xml:space="preserve"> PAGEREF _Toc240271103 \h </w:instrText>
             </w:r>
             <w:r>
               <w:rPr>
@@ -1107,7 +1107,7 @@
               <w14:ligatures w14:val="standardContextual"/>
             </w:rPr>
           </w:pPr>
-          <w:hyperlink w:anchor="_Toc240098952" w:history="1">
+          <w:hyperlink w:anchor="_Toc240271104" w:history="1">
             <w:r>
               <w:rPr>
                 <w:rStyle w:val="Hyperlink"/>
@@ -1131,7 +1131,7 @@
               <w:rPr>
                 <w:noProof/>
               </w:rPr>
-              <w:instrText xml:space="preserve"> PAGEREF _Toc240098952 \h </w:instrText>
+              <w:instrText xml:space="preserve"> PAGEREF _Toc240271104 \h </w:instrText>
             </w:r>
             <w:r>
               <w:rPr>
@@ -1174,7 +1174,7 @@
               <w14:ligatures w14:val="standardContextual"/>
             </w:rPr>
           </w:pPr>
-          <w:hyperlink w:anchor="_Toc240098953" w:history="1">
+          <w:hyperlink w:anchor="_Toc240271105" w:history="1">
             <w:r>
               <w:rPr>
                 <w:rStyle w:val="Hyperlink"/>
@@ -1198,7 +1198,7 @@
               <w:rPr>
                 <w:noProof/>
               </w:rPr>
-              <w:instrText xml:space="preserve"> PAGEREF _Toc240098953 \h </w:instrText>
+              <w:instrText xml:space="preserve"> PAGEREF _Toc240271105 \h </w:instrText>
             </w:r>
             <w:r>
               <w:rPr>
@@ -1241,7 +1241,7 @@
               <w14:ligatures w14:val="standardContextual"/>
             </w:rPr>
           </w:pPr>
-          <w:hyperlink w:anchor="_Toc240098954" w:history="1">
+          <w:hyperlink w:anchor="_Toc240271106" w:history="1">
             <w:r>
               <w:rPr>
                 <w:rStyle w:val="Hyperlink"/>
@@ -1265,7 +1265,7 @@
               <w:rPr>
                 <w:noProof/>
               </w:rPr>
-              <w:instrText xml:space="preserve"> PAGEREF _Toc240098954 \h </w:instrText>
+              <w:instrText xml:space="preserve"> PAGEREF _Toc240271106 \h </w:instrText>
             </w:r>
             <w:r>
               <w:rPr>
@@ -1308,7 +1308,7 @@
               <w14:ligatures w14:val="standardContextual"/>
             </w:rPr>
           </w:pPr>
-          <w:hyperlink w:anchor="_Toc240098955" w:history="1">
+          <w:hyperlink w:anchor="_Toc240271107" w:history="1">
             <w:r>
               <w:rPr>
                 <w:rStyle w:val="Hyperlink"/>
@@ -1332,7 +1332,7 @@
               <w:rPr>
                 <w:noProof/>
               </w:rPr>
-              <w:instrText xml:space="preserve"> PAGEREF _Toc240098955 \h </w:instrText>
+              <w:instrText xml:space="preserve"> PAGEREF _Toc240271107 \h </w:instrText>
             </w:r>
             <w:r>
               <w:rPr>
@@ -1375,7 +1375,7 @@
               <w14:ligatures w14:val="standardContextual"/>
             </w:rPr>
           </w:pPr>
-          <w:hyperlink w:anchor="_Toc240098956" w:history="1">
+          <w:hyperlink w:anchor="_Toc240271108" w:history="1">
             <w:r>
               <w:rPr>
                 <w:rStyle w:val="Hyperlink"/>
@@ -1399,7 +1399,7 @@
               <w:rPr>
                 <w:noProof/>
               </w:rPr>
-              <w:instrText xml:space="preserve"> PAGEREF _Toc240098956 \h </w:instrText>
+              <w:instrText xml:space="preserve"> PAGEREF _Toc240271108 \h </w:instrText>
             </w:r>
             <w:r>
               <w:rPr>
@@ -1442,7 +1442,7 @@
               <w14:ligatures w14:val="standardContextual"/>
             </w:rPr>
           </w:pPr>
-          <w:hyperlink w:anchor="_Toc240098957" w:history="1">
+          <w:hyperlink w:anchor="_Toc240271109" w:history="1">
             <w:r>
               <w:rPr>
                 <w:rStyle w:val="Hyperlink"/>
@@ -1466,7 +1466,7 @@
               <w:rPr>
                 <w:noProof/>
               </w:rPr>
-              <w:instrText xml:space="preserve"> PAGEREF _Toc240098957 \h </w:instrText>
+              <w:instrText xml:space="preserve"> PAGEREF _Toc240271109 \h </w:instrText>
             </w:r>
             <w:r>
               <w:rPr>
@@ -1509,7 +1509,7 @@
               <w14:ligatures w14:val="standardContextual"/>
             </w:rPr>
           </w:pPr>
-          <w:hyperlink w:anchor="_Toc240098958" w:history="1">
+          <w:hyperlink w:anchor="_Toc240271110" w:history="1">
             <w:r>
               <w:rPr>
                 <w:rStyle w:val="Hyperlink"/>
@@ -1533,7 +1533,7 @@
               <w:rPr>
                 <w:noProof/>
               </w:rPr>
-              <w:instrText xml:space="preserve"> PAGEREF _Toc240098958 \h </w:instrText>
+              <w:instrText xml:space="preserve"> PAGEREF _Toc240271110 \h </w:instrText>
             </w:r>
             <w:r>
               <w:rPr>
@@ -1576,7 +1576,7 @@
               <w14:ligatures w14:val="standardContextual"/>
             </w:rPr>
           </w:pPr>
-          <w:hyperlink w:anchor="_Toc240098959" w:history="1">
+          <w:hyperlink w:anchor="_Toc240271111" w:history="1">
             <w:r>
               <w:rPr>
                 <w:rStyle w:val="Hyperlink"/>
@@ -1600,7 +1600,7 @@
               <w:rPr>
                 <w:noProof/>
               </w:rPr>
-              <w:instrText xml:space="preserve"> PAGEREF _Toc240098959 \h </w:instrText>
+              <w:instrText xml:space="preserve"> PAGEREF _Toc240271111 \h </w:instrText>
             </w:r>
             <w:r>
               <w:rPr>
@@ -1643,7 +1643,7 @@
               <w14:ligatures w14:val="standardContextual"/>
             </w:rPr>
           </w:pPr>
-          <w:hyperlink w:anchor="_Toc240098960" w:history="1">
+          <w:hyperlink w:anchor="_Toc240271112" w:history="1">
             <w:r>
               <w:rPr>
                 <w:rStyle w:val="Hyperlink"/>
@@ -1667,7 +1667,7 @@
               <w:rPr>
                 <w:noProof/>
               </w:rPr>
-              <w:instrText xml:space="preserve"> PAGEREF _Toc240098960 \h </w:instrText>
+              <w:instrText xml:space="preserve"> PAGEREF _Toc240271112 \h </w:instrText>
             </w:r>
             <w:r>
               <w:rPr>
@@ -1710,7 +1710,7 @@
               <w14:ligatures w14:val="standardContextual"/>
             </w:rPr>
           </w:pPr>
-          <w:hyperlink w:anchor="_Toc240098961" w:history="1">
+          <w:hyperlink w:anchor="_Toc240271113" w:history="1">
             <w:r>
               <w:rPr>
                 <w:rStyle w:val="Hyperlink"/>
@@ -1734,7 +1734,7 @@
               <w:rPr>
                 <w:noProof/>
               </w:rPr>
-              <w:instrText xml:space="preserve"> PAGEREF _Toc240098961 \h </w:instrText>
+              <w:instrText xml:space="preserve"> PAGEREF _Toc240271113 \h </w:instrText>
             </w:r>
             <w:r>
               <w:rPr>
@@ -1777,7 +1777,7 @@
               <w14:ligatures w14:val="standardContextual"/>
             </w:rPr>
           </w:pPr>
-          <w:hyperlink w:anchor="_Toc240098962" w:history="1">
+          <w:hyperlink w:anchor="_Toc240271114" w:history="1">
             <w:r>
               <w:rPr>
                 <w:rStyle w:val="Hyperlink"/>
@@ -1801,7 +1801,7 @@
               <w:rPr>
                 <w:noProof/>
               </w:rPr>
-              <w:instrText xml:space="preserve"> PAGEREF _Toc240098962 \h </w:instrText>
+              <w:instrText xml:space="preserve"> PAGEREF _Toc240271114 \h </w:instrText>
             </w:r>
             <w:r>
               <w:rPr>
@@ -1844,7 +1844,7 @@
               <w14:ligatures w14:val="standardContextual"/>
             </w:rPr>
           </w:pPr>
-          <w:hyperlink w:anchor="_Toc240098963" w:history="1">
+          <w:hyperlink w:anchor="_Toc240271115" w:history="1">
             <w:r>
               <w:rPr>
                 <w:rStyle w:val="Hyperlink"/>
@@ -1868,7 +1868,7 @@
               <w:rPr>
                 <w:noProof/>
               </w:rPr>
-              <w:instrText xml:space="preserve"> PAGEREF _Toc240098963 \h </w:instrText>
+              <w:instrText xml:space="preserve"> PAGEREF _Toc240271115 \h </w:instrText>
             </w:r>
             <w:r>
               <w:rPr>
@@ -1911,7 +1911,7 @@
               <w14:ligatures w14:val="standardContextual"/>
             </w:rPr>
           </w:pPr>
-          <w:hyperlink w:anchor="_Toc240098964" w:history="1">
+          <w:hyperlink w:anchor="_Toc240271116" w:history="1">
             <w:r>
               <w:rPr>
                 <w:rStyle w:val="Hyperlink"/>
@@ -1935,7 +1935,7 @@
               <w:rPr>
                 <w:noProof/>
               </w:rPr>
-              <w:instrText xml:space="preserve"> PAGEREF _Toc240098964 \h </w:instrText>
+              <w:instrText xml:space="preserve"> PAGEREF _Toc240271116 \h </w:instrText>
             </w:r>
             <w:r>
               <w:rPr>
@@ -1978,7 +1978,7 @@
               <w14:ligatures w14:val="standardContextual"/>
             </w:rPr>
           </w:pPr>
-          <w:hyperlink w:anchor="_Toc240098965" w:history="1">
+          <w:hyperlink w:anchor="_Toc240271117" w:history="1">
             <w:r>
               <w:rPr>
                 <w:rStyle w:val="Hyperlink"/>
@@ -2002,7 +2002,7 @@
               <w:rPr>
                 <w:noProof/>
               </w:rPr>
-              <w:instrText xml:space="preserve"> PAGEREF _Toc240098965 \h </w:instrText>
+              <w:instrText xml:space="preserve"> PAGEREF _Toc240271117 \h </w:instrText>
             </w:r>
             <w:r>
               <w:rPr>
@@ -2045,7 +2045,7 @@
               <w14:ligatures w14:val="standardContextual"/>
             </w:rPr>
           </w:pPr>
-          <w:hyperlink w:anchor="_Toc240098966" w:history="1">
+          <w:hyperlink w:anchor="_Toc240271118" w:history="1">
             <w:r>
               <w:rPr>
                 <w:rStyle w:val="Hyperlink"/>
@@ -2069,7 +2069,7 @@
               <w:rPr>
                 <w:noProof/>
               </w:rPr>
-              <w:instrText xml:space="preserve"> PAGEREF _Toc240098966 \h </w:instrText>
+              <w:instrText xml:space="preserve"> PAGEREF _Toc240271118 \h </w:instrText>
             </w:r>
             <w:r>
               <w:rPr>
@@ -2112,7 +2112,7 @@
               <w14:ligatures w14:val="standardContextual"/>
             </w:rPr>
           </w:pPr>
-          <w:hyperlink w:anchor="_Toc240098967" w:history="1">
+          <w:hyperlink w:anchor="_Toc240271119" w:history="1">
             <w:r>
               <w:rPr>
                 <w:rStyle w:val="Hyperlink"/>
@@ -2136,7 +2136,7 @@
               <w:rPr>
                 <w:noProof/>
               </w:rPr>
-              <w:instrText xml:space="preserve"> PAGEREF _Toc240098967 \h </w:instrText>
+              <w:instrText xml:space="preserve"> PAGEREF _Toc240271119 \h </w:instrText>
             </w:r>
             <w:r>
               <w:rPr>
@@ -2179,7 +2179,7 @@
               <w14:ligatures w14:val="standardContextual"/>
             </w:rPr>
           </w:pPr>
-          <w:hyperlink w:anchor="_Toc240098968" w:history="1">
+          <w:hyperlink w:anchor="_Toc240271120" w:history="1">
             <w:r>
               <w:rPr>
                 <w:rStyle w:val="Hyperlink"/>
@@ -2203,7 +2203,7 @@
               <w:rPr>
                 <w:noProof/>
               </w:rPr>
-              <w:instrText xml:space="preserve"> PAGEREF _Toc240098968 \h </w:instrText>
+              <w:instrText xml:space="preserve"> PAGEREF _Toc240271120 \h </w:instrText>
             </w:r>
             <w:r>
               <w:rPr>
@@ -2246,7 +2246,7 @@
               <w14:ligatures w14:val="standardContextual"/>
             </w:rPr>
           </w:pPr>
-          <w:hyperlink w:anchor="_Toc240098969" w:history="1">
+          <w:hyperlink w:anchor="_Toc240271121" w:history="1">
             <w:r>
               <w:rPr>
                 <w:rStyle w:val="Hyperlink"/>
@@ -2270,7 +2270,7 @@
               <w:rPr>
                 <w:noProof/>
               </w:rPr>
-              <w:instrText xml:space="preserve"> PAGEREF _Toc240098969 \h </w:instrText>
+              <w:instrText xml:space="preserve"> PAGEREF _Toc240271121 \h </w:instrText>
             </w:r>
             <w:r>
               <w:rPr>
@@ -2313,7 +2313,7 @@
               <w14:ligatures w14:val="standardContextual"/>
             </w:rPr>
           </w:pPr>
-          <w:hyperlink w:anchor="_Toc240098970" w:history="1">
+          <w:hyperlink w:anchor="_Toc240271122" w:history="1">
             <w:r>
               <w:rPr>
                 <w:rStyle w:val="Hyperlink"/>
@@ -2337,7 +2337,7 @@
               <w:rPr>
                 <w:noProof/>
               </w:rPr>
-              <w:instrText xml:space="preserve"> PAGEREF _Toc240098970 \h </w:instrText>
+              <w:instrText xml:space="preserve"> PAGEREF _Toc240271122 \h </w:instrText>
             </w:r>
             <w:r>
               <w:rPr>
@@ -2380,7 +2380,7 @@
               <w14:ligatures w14:val="standardContextual"/>
             </w:rPr>
           </w:pPr>
-          <w:hyperlink w:anchor="_Toc240098971" w:history="1">
+          <w:hyperlink w:anchor="_Toc240271123" w:history="1">
             <w:r>
               <w:rPr>
                 <w:rStyle w:val="Hyperlink"/>
@@ -2404,7 +2404,7 @@
               <w:rPr>
                 <w:noProof/>
               </w:rPr>
-              <w:instrText xml:space="preserve"> PAGEREF _Toc240098971 \h </w:instrText>
+              <w:instrText xml:space="preserve"> PAGEREF _Toc240271123 \h </w:instrText>
             </w:r>
             <w:r>
               <w:rPr>
@@ -2460,7 +2460,7 @@
         <w:pStyle w:val="Heading1"/>
         <w:spacing w:before="320" w:after="160"/>
       </w:pPr>
-      <w:bookmarkStart w:id="1" w:name="_Toc240098946"/>
+      <w:bookmarkStart w:id="1" w:name="_Toc240271098"/>
       <w:r>
         <w:t>1. Giới thiệu</w:t>
       </w:r>
@@ -2471,7 +2471,7 @@
         <w:pStyle w:val="Heading2"/>
         <w:spacing w:before="240" w:after="120"/>
       </w:pPr>
-      <w:bookmarkStart w:id="2" w:name="_Toc240098947"/>
+      <w:bookmarkStart w:id="2" w:name="_Toc240271099"/>
       <w:r>
         <w:t>1.1. Bối cảnh và bài toán</w:t>
       </w:r>
@@ -2498,7 +2498,7 @@
         <w:pStyle w:val="Heading2"/>
         <w:spacing w:before="240" w:after="120"/>
       </w:pPr>
-      <w:bookmarkStart w:id="3" w:name="_Toc240098948"/>
+      <w:bookmarkStart w:id="3" w:name="_Toc240271100"/>
       <w:r>
         <w:t>1.2. Mục tiêu đồ án</w:t>
       </w:r>
@@ -2517,7 +2517,7 @@
         <w:pStyle w:val="Heading1"/>
         <w:spacing w:before="320" w:after="160"/>
       </w:pPr>
-      <w:bookmarkStart w:id="4" w:name="_Toc240098949"/>
+      <w:bookmarkStart w:id="4" w:name="_Toc240271101"/>
       <w:r>
         <w:t>2. Kiến trúc hệ thống tổng quan</w:t>
       </w:r>
@@ -2541,7 +2541,7 @@
           <w:noProof/>
         </w:rPr>
         <w:drawing>
-          <wp:inline distT="0" distB="0" distL="0" distR="0" wp14:anchorId="13620B76" wp14:editId="335E5D5F">
+          <wp:inline distT="0" distB="0" distL="0" distR="0" wp14:anchorId="0053E5CA" wp14:editId="2DA334CD">
             <wp:extent cx="5334000" cy="2724150"/>
             <wp:effectExtent l="0" t="0" r="0" b="0"/>
             <wp:docPr id="1" name="Picture 1"/>
@@ -2686,7 +2686,7 @@
         <w:pStyle w:val="Heading1"/>
         <w:spacing w:before="320" w:after="160"/>
       </w:pPr>
-      <w:bookmarkStart w:id="5" w:name="_Toc240098950"/>
+      <w:bookmarkStart w:id="5" w:name="_Toc240271102"/>
       <w:r>
         <w:t>3. Thiết kế chi tiết từng tầng</w:t>
       </w:r>
@@ -2697,7 +2697,7 @@
         <w:pStyle w:val="Heading2"/>
         <w:spacing w:before="240" w:after="120"/>
       </w:pPr>
-      <w:bookmarkStart w:id="6" w:name="_Toc240098951"/>
+      <w:bookmarkStart w:id="6" w:name="_Toc240271103"/>
       <w:r>
         <w:t>3.1. Tầng IoT (Edge Node)</w:t>
       </w:r>
@@ -2726,7 +2726,7 @@
           <w:left w:w="10" w:type="dxa"/>
           <w:right w:w="10" w:type="dxa"/>
         </w:tblCellMar>
-        <w:tblLook w:val="0000" w:firstRow="0" w:lastRow="0" w:firstColumn="0" w:lastColumn="0" w:noHBand="0" w:noVBand="0"/>
+        <w:tblLook w:val="04A0" w:firstRow="1" w:lastRow="0" w:firstColumn="1" w:lastColumn="0" w:noHBand="0" w:noVBand="1"/>
       </w:tblPr>
       <w:tblGrid>
         <w:gridCol w:w="941"/>
@@ -3334,7 +3334,7 @@
         <w:pStyle w:val="Heading2"/>
         <w:spacing w:before="240" w:after="120"/>
       </w:pPr>
-      <w:bookmarkStart w:id="7" w:name="_Toc240098952"/>
+      <w:bookmarkStart w:id="7" w:name="_Toc240271104"/>
       <w:r>
         <w:t>3.2. Tầng AI (Federated Learning)</w:t>
       </w:r>
@@ -3345,7 +3345,7 @@
         <w:pStyle w:val="Heading3"/>
         <w:spacing w:before="180" w:after="100"/>
       </w:pPr>
-      <w:bookmarkStart w:id="8" w:name="_Toc240098953"/>
+      <w:bookmarkStart w:id="8" w:name="_Toc240271105"/>
       <w:r>
         <w:t>3.2.1. Kiến trúc mô hình</w:t>
       </w:r>
@@ -3411,7 +3411,7 @@
         <w:pStyle w:val="Heading3"/>
         <w:spacing w:before="180" w:after="100"/>
       </w:pPr>
-      <w:bookmarkStart w:id="9" w:name="_Toc240098954"/>
+      <w:bookmarkStart w:id="9" w:name="_Toc240271106"/>
       <w:r>
         <w:t>3.2.2. Huấn luyện cục bộ (local training)</w:t>
       </w:r>
@@ -3440,7 +3440,7 @@
           <w:left w:w="10" w:type="dxa"/>
           <w:right w:w="10" w:type="dxa"/>
         </w:tblCellMar>
-        <w:tblLook w:val="0000" w:firstRow="0" w:lastRow="0" w:firstColumn="0" w:lastColumn="0" w:noHBand="0" w:noVBand="0"/>
+        <w:tblLook w:val="04A0" w:firstRow="1" w:lastRow="0" w:firstColumn="1" w:lastColumn="0" w:noHBand="0" w:noVBand="1"/>
       </w:tblPr>
       <w:tblGrid>
         <w:gridCol w:w="1311"/>
@@ -3830,7 +3830,7 @@
         <w:pStyle w:val="Heading3"/>
         <w:spacing w:before="180" w:after="100"/>
       </w:pPr>
-      <w:bookmarkStart w:id="10" w:name="_Toc240098955"/>
+      <w:bookmarkStart w:id="10" w:name="_Toc240271107"/>
       <w:r>
         <w:t>3.2.3. Tổng hợp FedAvg</w:t>
       </w:r>
@@ -3874,7 +3874,7 @@
         <w:pStyle w:val="Heading3"/>
         <w:spacing w:before="180" w:after="100"/>
       </w:pPr>
-      <w:bookmarkStart w:id="11" w:name="_Toc240098956"/>
+      <w:bookmarkStart w:id="11" w:name="_Toc240271108"/>
       <w:r>
         <w:t>3.2.4. Vòng lặp huấn luyện và tiêu chí đánh giá</w:t>
       </w:r>
@@ -3984,7 +3984,7 @@
         <w:pStyle w:val="Heading2"/>
         <w:spacing w:before="240" w:after="120"/>
       </w:pPr>
-      <w:bookmarkStart w:id="12" w:name="_Toc240098957"/>
+      <w:bookmarkStart w:id="12" w:name="_Toc240271109"/>
       <w:r>
         <w:t>3.3. Tầng Blockchain (Smart Contract)</w:t>
       </w:r>
@@ -4003,7 +4003,7 @@
         <w:pStyle w:val="Heading3"/>
         <w:spacing w:before="180" w:after="100"/>
       </w:pPr>
-      <w:bookmarkStart w:id="13" w:name="_Toc240098958"/>
+      <w:bookmarkStart w:id="13" w:name="_Toc240271110"/>
       <w:r>
         <w:t>3.3.1. BlockFLToken.sol — token ERC-20 thưởng</w:t>
       </w:r>
@@ -4022,7 +4022,7 @@
         <w:pStyle w:val="Heading3"/>
         <w:spacing w:before="180" w:after="100"/>
       </w:pPr>
-      <w:bookmarkStart w:id="14" w:name="_Toc240098959"/>
+      <w:bookmarkStart w:id="14" w:name="_Toc240271111"/>
       <w:r>
         <w:t>3.3.2. FederatedAggregator.sol — điều phối round FL</w:t>
       </w:r>
@@ -4043,7 +4043,7 @@
           <w:left w:w="10" w:type="dxa"/>
           <w:right w:w="10" w:type="dxa"/>
         </w:tblCellMar>
-        <w:tblLook w:val="0000" w:firstRow="0" w:lastRow="0" w:firstColumn="0" w:lastColumn="0" w:noHBand="0" w:noVBand="0"/>
+        <w:tblLook w:val="04A0" w:firstRow="1" w:lastRow="0" w:firstColumn="1" w:lastColumn="0" w:noHBand="0" w:noVBand="1"/>
       </w:tblPr>
       <w:tblGrid>
         <w:gridCol w:w="2916"/>
@@ -4448,7 +4448,7 @@
         <w:pStyle w:val="Heading1"/>
         <w:spacing w:before="320" w:after="160"/>
       </w:pPr>
-      <w:bookmarkStart w:id="15" w:name="_Toc240098960"/>
+      <w:bookmarkStart w:id="15" w:name="_Toc240271112"/>
       <w:r>
         <w:t>4. Công nghệ sử dụng</w:t>
       </w:r>
@@ -4469,7 +4469,7 @@
           <w:left w:w="10" w:type="dxa"/>
           <w:right w:w="10" w:type="dxa"/>
         </w:tblCellMar>
-        <w:tblLook w:val="0000" w:firstRow="0" w:lastRow="0" w:firstColumn="0" w:lastColumn="0" w:noHBand="0" w:noVBand="0"/>
+        <w:tblLook w:val="04A0" w:firstRow="1" w:lastRow="0" w:firstColumn="1" w:lastColumn="0" w:noHBand="0" w:noVBand="1"/>
       </w:tblPr>
       <w:tblGrid>
         <w:gridCol w:w="3061"/>
@@ -4828,7 +4828,7 @@
         <w:pStyle w:val="Heading1"/>
         <w:spacing w:before="320" w:after="160"/>
       </w:pPr>
-      <w:bookmarkStart w:id="16" w:name="_Toc240098961"/>
+      <w:bookmarkStart w:id="16" w:name="_Toc240271113"/>
       <w:r>
         <w:t>5. Kết quả thực nghiệm</w:t>
       </w:r>
@@ -4839,7 +4839,7 @@
         <w:pStyle w:val="Heading2"/>
         <w:spacing w:before="240" w:after="120"/>
       </w:pPr>
-      <w:bookmarkStart w:id="17" w:name="_Toc240098962"/>
+      <w:bookmarkStart w:id="17" w:name="_Toc240271114"/>
       <w:r>
         <w:t>5.1. Hội tụ của Global Model qua từng round</w:t>
       </w:r>
@@ -4863,10 +4863,10 @@
           <w:noProof/>
         </w:rPr>
         <w:drawing>
-          <wp:inline distT="0" distB="0" distL="0" distR="0" wp14:anchorId="4630E57F" wp14:editId="5CE106C3">
+          <wp:inline distT="0" distB="0" distL="0" distR="0" wp14:anchorId="692D5BB6" wp14:editId="0C244909">
             <wp:extent cx="4572000" cy="2571750"/>
             <wp:effectExtent l="0" t="0" r="0" b="0"/>
-            <wp:docPr id="1604654460" name="Picture 1604654460"/>
+            <wp:docPr id="2111218277" name="Picture 2111218277"/>
             <wp:cNvGraphicFramePr>
               <a:graphicFrameLocks xmlns:a="http://schemas.openxmlformats.org/drawingml/2006/main" noChangeAspect="1"/>
             </wp:cNvGraphicFramePr>
@@ -4932,7 +4932,7 @@
           <w:left w:w="10" w:type="dxa"/>
           <w:right w:w="10" w:type="dxa"/>
         </w:tblCellMar>
-        <w:tblLook w:val="0000" w:firstRow="0" w:lastRow="0" w:firstColumn="0" w:lastColumn="0" w:noHBand="0" w:noVBand="0"/>
+        <w:tblLook w:val="04A0" w:firstRow="1" w:lastRow="0" w:firstColumn="1" w:lastColumn="0" w:noHBand="0" w:noVBand="1"/>
       </w:tblPr>
       <w:tblGrid>
         <w:gridCol w:w="1931"/>
@@ -5636,7 +5636,7 @@
         <w:pStyle w:val="Heading2"/>
         <w:spacing w:before="240" w:after="120"/>
       </w:pPr>
-      <w:bookmarkStart w:id="18" w:name="_Toc240098963"/>
+      <w:bookmarkStart w:id="18" w:name="_Toc240271115"/>
       <w:r>
         <w:t>5.2. So sánh FedAvg với từng node tự huấn luyện riêng lẻ</w:t>
       </w:r>
@@ -5660,10 +5660,10 @@
           <w:noProof/>
         </w:rPr>
         <w:drawing>
-          <wp:inline distT="0" distB="0" distL="0" distR="0" wp14:anchorId="3FCD4793" wp14:editId="413F98FC">
+          <wp:inline distT="0" distB="0" distL="0" distR="0" wp14:anchorId="671291AB" wp14:editId="4E6B3E30">
             <wp:extent cx="4572000" cy="2571750"/>
             <wp:effectExtent l="0" t="0" r="0" b="0"/>
-            <wp:docPr id="369612156" name="Picture 369612156"/>
+            <wp:docPr id="1055044102" name="Picture 1055044102"/>
             <wp:cNvGraphicFramePr>
               <a:graphicFrameLocks xmlns:a="http://schemas.openxmlformats.org/drawingml/2006/main" noChangeAspect="1"/>
             </wp:cNvGraphicFramePr>
@@ -5729,7 +5729,7 @@
           <w:left w:w="10" w:type="dxa"/>
           <w:right w:w="10" w:type="dxa"/>
         </w:tblCellMar>
-        <w:tblLook w:val="0000" w:firstRow="0" w:lastRow="0" w:firstColumn="0" w:lastColumn="0" w:noHBand="0" w:noVBand="0"/>
+        <w:tblLook w:val="04A0" w:firstRow="1" w:lastRow="0" w:firstColumn="1" w:lastColumn="0" w:noHBand="0" w:noVBand="1"/>
       </w:tblPr>
       <w:tblGrid>
         <w:gridCol w:w="776"/>
@@ -6157,7 +6157,7 @@
         <w:pStyle w:val="Heading2"/>
         <w:spacing w:before="240" w:after="120"/>
       </w:pPr>
-      <w:bookmarkStart w:id="19" w:name="_Toc240098964"/>
+      <w:bookmarkStart w:id="19" w:name="_Toc240271116"/>
       <w:r>
         <w:t>5.3. Kiểm định độ ổn định qua nhiều lần chia dữ liệu</w:t>
       </w:r>
@@ -6181,10 +6181,10 @@
           <w:noProof/>
         </w:rPr>
         <w:drawing>
-          <wp:inline distT="0" distB="0" distL="0" distR="0" wp14:anchorId="3FDCD96F" wp14:editId="168E41A8">
+          <wp:inline distT="0" distB="0" distL="0" distR="0" wp14:anchorId="033D94F4" wp14:editId="6C87FC20">
             <wp:extent cx="4572000" cy="2571750"/>
             <wp:effectExtent l="0" t="0" r="0" b="0"/>
-            <wp:docPr id="1365081449" name="Picture 1365081449"/>
+            <wp:docPr id="1250045459" name="Picture 1250045459"/>
             <wp:cNvGraphicFramePr>
               <a:graphicFrameLocks xmlns:a="http://schemas.openxmlformats.org/drawingml/2006/main" noChangeAspect="1"/>
             </wp:cNvGraphicFramePr>
@@ -6250,7 +6250,7 @@
           <w:left w:w="10" w:type="dxa"/>
           <w:right w:w="10" w:type="dxa"/>
         </w:tblCellMar>
-        <w:tblLook w:val="0000" w:firstRow="0" w:lastRow="0" w:firstColumn="0" w:lastColumn="0" w:noHBand="0" w:noVBand="0"/>
+        <w:tblLook w:val="04A0" w:firstRow="1" w:lastRow="0" w:firstColumn="1" w:lastColumn="0" w:noHBand="0" w:noVBand="1"/>
       </w:tblPr>
       <w:tblGrid>
         <w:gridCol w:w="6004"/>
@@ -6550,7 +6550,7 @@
           <w:left w:w="10" w:type="dxa"/>
           <w:right w:w="10" w:type="dxa"/>
         </w:tblCellMar>
-        <w:tblLook w:val="0000" w:firstRow="0" w:lastRow="0" w:firstColumn="0" w:lastColumn="0" w:noHBand="0" w:noVBand="0"/>
+        <w:tblLook w:val="04A0" w:firstRow="1" w:lastRow="0" w:firstColumn="1" w:lastColumn="0" w:noHBand="0" w:noVBand="1"/>
       </w:tblPr>
       <w:tblGrid>
         <w:gridCol w:w="656"/>
@@ -7818,7 +7818,7 @@
         <w:pStyle w:val="Heading2"/>
         <w:spacing w:before="240" w:after="120"/>
       </w:pPr>
-      <w:bookmarkStart w:id="20" w:name="_Toc240098965"/>
+      <w:bookmarkStart w:id="20" w:name="_Toc240271117"/>
       <w:r>
         <w:t>5.4. Kiểm thử smart contract</w:t>
       </w:r>
@@ -7837,7 +7837,7 @@
         <w:pStyle w:val="Heading2"/>
         <w:spacing w:before="240" w:after="120"/>
       </w:pPr>
-      <w:bookmarkStart w:id="21" w:name="_Toc240098966"/>
+      <w:bookmarkStart w:id="21" w:name="_Toc240271118"/>
       <w:r>
         <w:t>5.5. Minh bạch và chống chối bỏ trên chuỗi</w:t>
       </w:r>
@@ -7856,7 +7856,7 @@
         <w:pStyle w:val="Heading1"/>
         <w:spacing w:before="320" w:after="160"/>
       </w:pPr>
-      <w:bookmarkStart w:id="22" w:name="_Toc240098967"/>
+      <w:bookmarkStart w:id="22" w:name="_Toc240271119"/>
       <w:r>
         <w:t>6. Đánh giá rủi ro và phương án xử lý</w:t>
       </w:r>
@@ -7877,7 +7877,7 @@
           <w:left w:w="10" w:type="dxa"/>
           <w:right w:w="10" w:type="dxa"/>
         </w:tblCellMar>
-        <w:tblLook w:val="0000" w:firstRow="0" w:lastRow="0" w:firstColumn="0" w:lastColumn="0" w:noHBand="0" w:noVBand="0"/>
+        <w:tblLook w:val="04A0" w:firstRow="1" w:lastRow="0" w:firstColumn="1" w:lastColumn="0" w:noHBand="0" w:noVBand="1"/>
       </w:tblPr>
       <w:tblGrid>
         <w:gridCol w:w="3090"/>
@@ -8152,7 +8152,7 @@
         <w:pStyle w:val="Heading1"/>
         <w:spacing w:before="320" w:after="160"/>
       </w:pPr>
-      <w:bookmarkStart w:id="23" w:name="_Toc240098968"/>
+      <w:bookmarkStart w:id="23" w:name="_Toc240271120"/>
       <w:r>
         <w:t>7. Kết luận và hướng phát triển</w:t>
       </w:r>
@@ -8231,7 +8231,7 @@
         <w:pStyle w:val="Heading1"/>
         <w:spacing w:before="320" w:after="160"/>
       </w:pPr>
-      <w:bookmarkStart w:id="24" w:name="_Toc240098969"/>
+      <w:bookmarkStart w:id="24" w:name="_Toc240271121"/>
       <w:r>
         <w:t>8. Cấu trúc repository GitHub</w:t>
       </w:r>
@@ -8354,7 +8354,7 @@
         <w:spacing w:after="160"/>
       </w:pPr>
       <w:r>
-        <w:t>Repository công khai (Public) trên GitHub, link: [Điền link GitHub repository].</w:t>
+        <w:t>Repository công khai (Public) trên GitHub, link: https://github.com/minhchien2329/BlockFL.</w:t>
       </w:r>
     </w:p>
     <w:p>
@@ -8362,7 +8362,7 @@
         <w:pStyle w:val="Heading1"/>
         <w:spacing w:before="320" w:after="160"/>
       </w:pPr>
-      <w:bookmarkStart w:id="25" w:name="_Toc240098970"/>
+      <w:bookmarkStart w:id="25" w:name="_Toc240271122"/>
       <w:r>
         <w:t>9. Phân công nhiệm vụ</w:t>
       </w:r>
@@ -8391,7 +8391,7 @@
           <w:left w:w="10" w:type="dxa"/>
           <w:right w:w="10" w:type="dxa"/>
         </w:tblCellMar>
-        <w:tblLook w:val="0000" w:firstRow="0" w:lastRow="0" w:firstColumn="0" w:lastColumn="0" w:noHBand="0" w:noVBand="0"/>
+        <w:tblLook w:val="04A0" w:firstRow="1" w:lastRow="0" w:firstColumn="1" w:lastColumn="0" w:noHBand="0" w:noVBand="1"/>
       </w:tblPr>
       <w:tblGrid>
         <w:gridCol w:w="2936"/>
@@ -8666,7 +8666,7 @@
         <w:pStyle w:val="Heading1"/>
         <w:spacing w:before="320" w:after="160"/>
       </w:pPr>
-      <w:bookmarkStart w:id="26" w:name="_Toc240098971"/>
+      <w:bookmarkStart w:id="26" w:name="_Toc240271123"/>
       <w:r>
         <w:t>10. Tài liệu tham khảo</w:t>
       </w:r>
@@ -8872,10 +8872,10 @@
 <file path=word/numbering.xml><?xml version="1.0" encoding="utf-8"?>
 <w:numbering xmlns:wpc="http://schemas.microsoft.com/office/word/2010/wordprocessingCanvas" xmlns:cx="http://schemas.microsoft.com/office/drawing/2014/chartex" xmlns:cx1="http://schemas.microsoft.com/office/drawing/2015/9/8/chartex" xmlns:cx2="http://schemas.microsoft.com/office/drawing/2015/10/21/chartex" xmlns:cx3="http://schemas.microsoft.com/office/drawing/2016/5/9/chartex" xmlns:cx4="http://schemas.microsoft.com/office/drawing/2016/5/10/chartex" xmlns:cx5="http://schemas.microsoft.com/office/drawing/2016/5/11/chartex" xmlns:cx6="http://schemas.microsoft.com/office/drawing/2016/5/12/chartex" xmlns:cx7="http://schemas.microsoft.com/office/drawing/2016/5/13/chartex" xmlns:cx8="http://schemas.microsoft.com/office/drawing/2016/5/14/chartex" xmlns:mc="http://schemas.openxmlformats.org/markup-compatibility/2006" xmlns:aink="http://schemas.microsoft.com/office/drawing/2016/ink" xmlns:am3d="http://schemas.microsoft.com/office/drawing/2017/model3d" xmlns:o="urn:schemas-microsoft-com:office:office" xmlns:oel="http://schemas.microsoft.com/office/2019/extlst" xmlns:r="http://schemas.openxmlformats.org/officeDocument/2006/relationships" xmlns:m="http://schemas.openxmlformats.org/officeDocument/2006/math" xmlns:v="urn:schemas-microsoft-com:vml" xmlns:wp14="http://schemas.microsoft.com/office/word/2010/wordprocessingDrawing" xmlns:wp="http://schemas.openxmlformats.org/drawingml/2006/wordprocessingDrawing" xmlns:w10="urn:schemas-microsoft-com:office:word" xmlns:w="http://schemas.openxmlformats.org/wordprocessingml/2006/main" xmlns:w14="http://schemas.microsoft.com/office/word/2010/wordml" xmlns:w15="http://schemas.microsoft.com/office/word/2012/wordml" xmlns:w16cex="http://schemas.microsoft.com/office/word/2018/wordml/cex" xmlns:w16cid="http://schemas.microsoft.com/office/word/2016/wordml/cid" xmlns:w16="http://schemas.microsoft.com/office/word/2018/wordml" xmlns:w16du="http://schemas.microsoft.com/office/word/2023/wordml/word16du" xmlns:w16sdtdh="http://schemas.microsoft.com/office/word/2020/wordml/sdtdatahash" xmlns:w16sdtfl="http://schemas.microsoft.com/office/word/2024/wordml/sdtformatlock" xmlns:w16se="http://schemas.microsoft.com/office/word/2015/wordml/symex" xmlns:wpg="http://schemas.microsoft.com/office/word/2010/wordprocessingGroup" xmlns:wpi="http://schemas.microsoft.com/office/word/2010/wordprocessingInk" xmlns:wne="http://schemas.microsoft.com/office/word/2006/wordml" xmlns:wps="http://schemas.microsoft.com/office/word/2010/wordprocessingShape" mc:Ignorable="w14 w15 w16se w16cid w16 w16cex w16sdtdh w16sdtfl w16du wp14">
   <w:abstractNum w:abstractNumId="0" w15:restartNumberingAfterBreak="0">
-    <w:nsid w:val="15AF1183"/>
+    <w:nsid w:val="14787FD9"/>
     <w:multiLevelType w:val="hybridMultilevel"/>
-    <w:tmpl w:val="7E5AAE42"/>
-    <w:lvl w:ilvl="0" w:tplc="A6B294C0">
+    <w:tmpl w:val="18A86C4C"/>
+    <w:lvl w:ilvl="0" w:tplc="3B464356">
       <w:start w:val="1"/>
       <w:numFmt w:val="bullet"/>
       <w:lvlText w:val="●"/>
@@ -8884,7 +8884,7 @@
         <w:ind w:left="720" w:hanging="360"/>
       </w:pPr>
     </w:lvl>
-    <w:lvl w:ilvl="1" w:tplc="0CD6EE18">
+    <w:lvl w:ilvl="1" w:tplc="A6241EC0">
       <w:start w:val="1"/>
       <w:numFmt w:val="bullet"/>
       <w:lvlText w:val="○"/>
@@ -8893,7 +8893,7 @@
         <w:ind w:left="1440" w:hanging="360"/>
       </w:pPr>
     </w:lvl>
-    <w:lvl w:ilvl="2" w:tplc="B6B6FF32">
+    <w:lvl w:ilvl="2" w:tplc="0E44C6BE">
       <w:start w:val="1"/>
       <w:numFmt w:val="bullet"/>
       <w:lvlText w:val="■"/>
@@ -8902,7 +8902,7 @@
         <w:ind w:left="2160" w:hanging="360"/>
       </w:pPr>
     </w:lvl>
-    <w:lvl w:ilvl="3" w:tplc="A66C072A">
+    <w:lvl w:ilvl="3" w:tplc="D9D0B762">
       <w:start w:val="1"/>
       <w:numFmt w:val="bullet"/>
       <w:lvlText w:val="●"/>
@@ -8911,7 +8911,7 @@
         <w:ind w:left="2880" w:hanging="360"/>
       </w:pPr>
     </w:lvl>
-    <w:lvl w:ilvl="4" w:tplc="24B80DAA">
+    <w:lvl w:ilvl="4" w:tplc="B210A86A">
       <w:start w:val="1"/>
       <w:numFmt w:val="bullet"/>
       <w:lvlText w:val="○"/>
@@ -8920,7 +8920,7 @@
         <w:ind w:left="3600" w:hanging="360"/>
       </w:pPr>
     </w:lvl>
-    <w:lvl w:ilvl="5" w:tplc="B4B03B44">
+    <w:lvl w:ilvl="5" w:tplc="8A9C05D2">
       <w:start w:val="1"/>
       <w:numFmt w:val="bullet"/>
       <w:lvlText w:val="■"/>
@@ -8929,7 +8929,7 @@
         <w:ind w:left="4320" w:hanging="360"/>
       </w:pPr>
     </w:lvl>
-    <w:lvl w:ilvl="6" w:tplc="FCEC8B14">
+    <w:lvl w:ilvl="6" w:tplc="BEB0FF9E">
       <w:start w:val="1"/>
       <w:numFmt w:val="bullet"/>
       <w:lvlText w:val="●"/>
@@ -8938,7 +8938,7 @@
         <w:ind w:left="5040" w:hanging="360"/>
       </w:pPr>
     </w:lvl>
-    <w:lvl w:ilvl="7" w:tplc="EF309E6E">
+    <w:lvl w:ilvl="7" w:tplc="EEBAFAA8">
       <w:start w:val="1"/>
       <w:numFmt w:val="bullet"/>
       <w:lvlText w:val="●"/>
@@ -8947,7 +8947,7 @@
         <w:ind w:left="5760" w:hanging="360"/>
       </w:pPr>
     </w:lvl>
-    <w:lvl w:ilvl="8" w:tplc="929279CE">
+    <w:lvl w:ilvl="8" w:tplc="80E6742C">
       <w:start w:val="1"/>
       <w:numFmt w:val="bullet"/>
       <w:lvlText w:val="●"/>
@@ -8957,7 +8957,7 @@
       </w:pPr>
     </w:lvl>
   </w:abstractNum>
-  <w:num w:numId="1" w16cid:durableId="1571378308">
+  <w:num w:numId="1" w16cid:durableId="1540048925">
     <w:abstractNumId w:val="0"/>
     <w:lvlOverride w:ilvl="0">
       <w:startOverride w:val="1"/>
@@ -9573,7 +9573,7 @@
     <w:autoRedefine/>
     <w:uiPriority w:val="39"/>
     <w:unhideWhenUsed/>
-    <w:rsid w:val="007C346C"/>
+    <w:rsid w:val="005A3169"/>
     <w:pPr>
       <w:spacing w:after="100"/>
     </w:pPr>
@@ -9585,7 +9585,7 @@
     <w:autoRedefine/>
     <w:uiPriority w:val="39"/>
     <w:unhideWhenUsed/>
-    <w:rsid w:val="007C346C"/>
+    <w:rsid w:val="005A3169"/>
     <w:pPr>
       <w:spacing w:after="100"/>
       <w:ind w:left="220"/>
@@ -9598,7 +9598,7 @@
     <w:autoRedefine/>
     <w:uiPriority w:val="39"/>
     <w:unhideWhenUsed/>
-    <w:rsid w:val="007C346C"/>
+    <w:rsid w:val="005A3169"/>
     <w:pPr>
       <w:spacing w:after="100"/>
       <w:ind w:left="440"/>

</xml_diff>

<commit_message>
Cap nhat link GitHub trong bao cao sang repo moi (BlockFL-nh-p)
</commit_message>
<xml_diff>
--- a/Report_NhomXX.docx
+++ b/Report_NhomXX.docx
@@ -161,7 +161,7 @@
         <w:t xml:space="preserve">Mã nguồn: </w:t>
       </w:r>
       <w:r>
-        <w:t>https://github.com/minhchien2329/BlockFL</w:t>
+        <w:t>https://github.com/minhchien2329/BlockFL-nh-p</w:t>
       </w:r>
     </w:p>
     <w:p>
@@ -600,7 +600,7 @@
         <w:pStyle w:val="Heading1"/>
         <w:spacing w:before="320" w:after="160"/>
       </w:pPr>
-      <w:bookmarkStart w:id="0" w:name="_Toc240271097"/>
+      <w:bookmarkStart w:id="0" w:name="_Toc240274837"/>
       <w:r>
         <w:t>Mục lục</w:t>
       </w:r>
@@ -609,7 +609,7 @@
     <w:sdt>
       <w:sdtPr>
         <w:alias w:val="Mục lục"/>
-        <w:id w:val="1171295067"/>
+        <w:id w:val="476811111"/>
       </w:sdtPr>
       <w:sdtEndPr/>
       <w:sdtContent>
@@ -638,7 +638,7 @@
           <w:r>
             <w:fldChar w:fldCharType="separate"/>
           </w:r>
-          <w:hyperlink w:anchor="_Toc240271097" w:history="1">
+          <w:hyperlink w:anchor="_Toc240274837" w:history="1">
             <w:r>
               <w:rPr>
                 <w:rStyle w:val="Hyperlink"/>
@@ -662,7 +662,7 @@
               <w:rPr>
                 <w:noProof/>
               </w:rPr>
-              <w:instrText xml:space="preserve"> PAGEREF _Toc240271097 \h </w:instrText>
+              <w:instrText xml:space="preserve"> PAGEREF _Toc240274837 \h </w:instrText>
             </w:r>
             <w:r>
               <w:rPr>
@@ -705,7 +705,7 @@
               <w14:ligatures w14:val="standardContextual"/>
             </w:rPr>
           </w:pPr>
-          <w:hyperlink w:anchor="_Toc240271098" w:history="1">
+          <w:hyperlink w:anchor="_Toc240274838" w:history="1">
             <w:r>
               <w:rPr>
                 <w:rStyle w:val="Hyperlink"/>
@@ -729,7 +729,7 @@
               <w:rPr>
                 <w:noProof/>
               </w:rPr>
-              <w:instrText xml:space="preserve"> PAGEREF _Toc240271098 \h </w:instrText>
+              <w:instrText xml:space="preserve"> PAGEREF _Toc240274838 \h </w:instrText>
             </w:r>
             <w:r>
               <w:rPr>
@@ -772,7 +772,7 @@
               <w14:ligatures w14:val="standardContextual"/>
             </w:rPr>
           </w:pPr>
-          <w:hyperlink w:anchor="_Toc240271099" w:history="1">
+          <w:hyperlink w:anchor="_Toc240274839" w:history="1">
             <w:r>
               <w:rPr>
                 <w:rStyle w:val="Hyperlink"/>
@@ -796,7 +796,7 @@
               <w:rPr>
                 <w:noProof/>
               </w:rPr>
-              <w:instrText xml:space="preserve"> PAGEREF _Toc240271099 \h </w:instrText>
+              <w:instrText xml:space="preserve"> PAGEREF _Toc240274839 \h </w:instrText>
             </w:r>
             <w:r>
               <w:rPr>
@@ -839,7 +839,7 @@
               <w14:ligatures w14:val="standardContextual"/>
             </w:rPr>
           </w:pPr>
-          <w:hyperlink w:anchor="_Toc240271100" w:history="1">
+          <w:hyperlink w:anchor="_Toc240274840" w:history="1">
             <w:r>
               <w:rPr>
                 <w:rStyle w:val="Hyperlink"/>
@@ -863,7 +863,7 @@
               <w:rPr>
                 <w:noProof/>
               </w:rPr>
-              <w:instrText xml:space="preserve"> PAGEREF _Toc240271100 \h </w:instrText>
+              <w:instrText xml:space="preserve"> PAGEREF _Toc240274840 \h </w:instrText>
             </w:r>
             <w:r>
               <w:rPr>
@@ -906,7 +906,7 @@
               <w14:ligatures w14:val="standardContextual"/>
             </w:rPr>
           </w:pPr>
-          <w:hyperlink w:anchor="_Toc240271101" w:history="1">
+          <w:hyperlink w:anchor="_Toc240274841" w:history="1">
             <w:r>
               <w:rPr>
                 <w:rStyle w:val="Hyperlink"/>
@@ -930,7 +930,7 @@
               <w:rPr>
                 <w:noProof/>
               </w:rPr>
-              <w:instrText xml:space="preserve"> PAGEREF _Toc240271101 \h </w:instrText>
+              <w:instrText xml:space="preserve"> PAGEREF _Toc240274841 \h </w:instrText>
             </w:r>
             <w:r>
               <w:rPr>
@@ -973,7 +973,7 @@
               <w14:ligatures w14:val="standardContextual"/>
             </w:rPr>
           </w:pPr>
-          <w:hyperlink w:anchor="_Toc240271102" w:history="1">
+          <w:hyperlink w:anchor="_Toc240274842" w:history="1">
             <w:r>
               <w:rPr>
                 <w:rStyle w:val="Hyperlink"/>
@@ -997,7 +997,7 @@
               <w:rPr>
                 <w:noProof/>
               </w:rPr>
-              <w:instrText xml:space="preserve"> PAGEREF _Toc240271102 \h </w:instrText>
+              <w:instrText xml:space="preserve"> PAGEREF _Toc240274842 \h </w:instrText>
             </w:r>
             <w:r>
               <w:rPr>
@@ -1040,7 +1040,7 @@
               <w14:ligatures w14:val="standardContextual"/>
             </w:rPr>
           </w:pPr>
-          <w:hyperlink w:anchor="_Toc240271103" w:history="1">
+          <w:hyperlink w:anchor="_Toc240274843" w:history="1">
             <w:r>
               <w:rPr>
                 <w:rStyle w:val="Hyperlink"/>
@@ -1064,7 +1064,7 @@
               <w:rPr>
                 <w:noProof/>
               </w:rPr>
-              <w:instrText xml:space="preserve"> PAGEREF _Toc240271103 \h </w:instrText>
+              <w:instrText xml:space="preserve"> PAGEREF _Toc240274843 \h </w:instrText>
             </w:r>
             <w:r>
               <w:rPr>
@@ -1107,7 +1107,7 @@
               <w14:ligatures w14:val="standardContextual"/>
             </w:rPr>
           </w:pPr>
-          <w:hyperlink w:anchor="_Toc240271104" w:history="1">
+          <w:hyperlink w:anchor="_Toc240274844" w:history="1">
             <w:r>
               <w:rPr>
                 <w:rStyle w:val="Hyperlink"/>
@@ -1131,7 +1131,7 @@
               <w:rPr>
                 <w:noProof/>
               </w:rPr>
-              <w:instrText xml:space="preserve"> PAGEREF _Toc240271104 \h </w:instrText>
+              <w:instrText xml:space="preserve"> PAGEREF _Toc240274844 \h </w:instrText>
             </w:r>
             <w:r>
               <w:rPr>
@@ -1174,7 +1174,7 @@
               <w14:ligatures w14:val="standardContextual"/>
             </w:rPr>
           </w:pPr>
-          <w:hyperlink w:anchor="_Toc240271105" w:history="1">
+          <w:hyperlink w:anchor="_Toc240274845" w:history="1">
             <w:r>
               <w:rPr>
                 <w:rStyle w:val="Hyperlink"/>
@@ -1198,7 +1198,7 @@
               <w:rPr>
                 <w:noProof/>
               </w:rPr>
-              <w:instrText xml:space="preserve"> PAGEREF _Toc240271105 \h </w:instrText>
+              <w:instrText xml:space="preserve"> PAGEREF _Toc240274845 \h </w:instrText>
             </w:r>
             <w:r>
               <w:rPr>
@@ -1241,7 +1241,7 @@
               <w14:ligatures w14:val="standardContextual"/>
             </w:rPr>
           </w:pPr>
-          <w:hyperlink w:anchor="_Toc240271106" w:history="1">
+          <w:hyperlink w:anchor="_Toc240274846" w:history="1">
             <w:r>
               <w:rPr>
                 <w:rStyle w:val="Hyperlink"/>
@@ -1265,7 +1265,7 @@
               <w:rPr>
                 <w:noProof/>
               </w:rPr>
-              <w:instrText xml:space="preserve"> PAGEREF _Toc240271106 \h </w:instrText>
+              <w:instrText xml:space="preserve"> PAGEREF _Toc240274846 \h </w:instrText>
             </w:r>
             <w:r>
               <w:rPr>
@@ -1308,7 +1308,7 @@
               <w14:ligatures w14:val="standardContextual"/>
             </w:rPr>
           </w:pPr>
-          <w:hyperlink w:anchor="_Toc240271107" w:history="1">
+          <w:hyperlink w:anchor="_Toc240274847" w:history="1">
             <w:r>
               <w:rPr>
                 <w:rStyle w:val="Hyperlink"/>
@@ -1332,7 +1332,7 @@
               <w:rPr>
                 <w:noProof/>
               </w:rPr>
-              <w:instrText xml:space="preserve"> PAGEREF _Toc240271107 \h </w:instrText>
+              <w:instrText xml:space="preserve"> PAGEREF _Toc240274847 \h </w:instrText>
             </w:r>
             <w:r>
               <w:rPr>
@@ -1375,7 +1375,7 @@
               <w14:ligatures w14:val="standardContextual"/>
             </w:rPr>
           </w:pPr>
-          <w:hyperlink w:anchor="_Toc240271108" w:history="1">
+          <w:hyperlink w:anchor="_Toc240274848" w:history="1">
             <w:r>
               <w:rPr>
                 <w:rStyle w:val="Hyperlink"/>
@@ -1399,7 +1399,7 @@
               <w:rPr>
                 <w:noProof/>
               </w:rPr>
-              <w:instrText xml:space="preserve"> PAGEREF _Toc240271108 \h </w:instrText>
+              <w:instrText xml:space="preserve"> PAGEREF _Toc240274848 \h </w:instrText>
             </w:r>
             <w:r>
               <w:rPr>
@@ -1442,7 +1442,7 @@
               <w14:ligatures w14:val="standardContextual"/>
             </w:rPr>
           </w:pPr>
-          <w:hyperlink w:anchor="_Toc240271109" w:history="1">
+          <w:hyperlink w:anchor="_Toc240274849" w:history="1">
             <w:r>
               <w:rPr>
                 <w:rStyle w:val="Hyperlink"/>
@@ -1466,7 +1466,7 @@
               <w:rPr>
                 <w:noProof/>
               </w:rPr>
-              <w:instrText xml:space="preserve"> PAGEREF _Toc240271109 \h </w:instrText>
+              <w:instrText xml:space="preserve"> PAGEREF _Toc240274849 \h </w:instrText>
             </w:r>
             <w:r>
               <w:rPr>
@@ -1509,7 +1509,7 @@
               <w14:ligatures w14:val="standardContextual"/>
             </w:rPr>
           </w:pPr>
-          <w:hyperlink w:anchor="_Toc240271110" w:history="1">
+          <w:hyperlink w:anchor="_Toc240274850" w:history="1">
             <w:r>
               <w:rPr>
                 <w:rStyle w:val="Hyperlink"/>
@@ -1533,7 +1533,7 @@
               <w:rPr>
                 <w:noProof/>
               </w:rPr>
-              <w:instrText xml:space="preserve"> PAGEREF _Toc240271110 \h </w:instrText>
+              <w:instrText xml:space="preserve"> PAGEREF _Toc240274850 \h </w:instrText>
             </w:r>
             <w:r>
               <w:rPr>
@@ -1576,7 +1576,7 @@
               <w14:ligatures w14:val="standardContextual"/>
             </w:rPr>
           </w:pPr>
-          <w:hyperlink w:anchor="_Toc240271111" w:history="1">
+          <w:hyperlink w:anchor="_Toc240274851" w:history="1">
             <w:r>
               <w:rPr>
                 <w:rStyle w:val="Hyperlink"/>
@@ -1600,7 +1600,7 @@
               <w:rPr>
                 <w:noProof/>
               </w:rPr>
-              <w:instrText xml:space="preserve"> PAGEREF _Toc240271111 \h </w:instrText>
+              <w:instrText xml:space="preserve"> PAGEREF _Toc240274851 \h </w:instrText>
             </w:r>
             <w:r>
               <w:rPr>
@@ -1643,7 +1643,7 @@
               <w14:ligatures w14:val="standardContextual"/>
             </w:rPr>
           </w:pPr>
-          <w:hyperlink w:anchor="_Toc240271112" w:history="1">
+          <w:hyperlink w:anchor="_Toc240274852" w:history="1">
             <w:r>
               <w:rPr>
                 <w:rStyle w:val="Hyperlink"/>
@@ -1667,7 +1667,7 @@
               <w:rPr>
                 <w:noProof/>
               </w:rPr>
-              <w:instrText xml:space="preserve"> PAGEREF _Toc240271112 \h </w:instrText>
+              <w:instrText xml:space="preserve"> PAGEREF _Toc240274852 \h </w:instrText>
             </w:r>
             <w:r>
               <w:rPr>
@@ -1710,7 +1710,7 @@
               <w14:ligatures w14:val="standardContextual"/>
             </w:rPr>
           </w:pPr>
-          <w:hyperlink w:anchor="_Toc240271113" w:history="1">
+          <w:hyperlink w:anchor="_Toc240274853" w:history="1">
             <w:r>
               <w:rPr>
                 <w:rStyle w:val="Hyperlink"/>
@@ -1734,7 +1734,7 @@
               <w:rPr>
                 <w:noProof/>
               </w:rPr>
-              <w:instrText xml:space="preserve"> PAGEREF _Toc240271113 \h </w:instrText>
+              <w:instrText xml:space="preserve"> PAGEREF _Toc240274853 \h </w:instrText>
             </w:r>
             <w:r>
               <w:rPr>
@@ -1777,7 +1777,7 @@
               <w14:ligatures w14:val="standardContextual"/>
             </w:rPr>
           </w:pPr>
-          <w:hyperlink w:anchor="_Toc240271114" w:history="1">
+          <w:hyperlink w:anchor="_Toc240274854" w:history="1">
             <w:r>
               <w:rPr>
                 <w:rStyle w:val="Hyperlink"/>
@@ -1801,7 +1801,7 @@
               <w:rPr>
                 <w:noProof/>
               </w:rPr>
-              <w:instrText xml:space="preserve"> PAGEREF _Toc240271114 \h </w:instrText>
+              <w:instrText xml:space="preserve"> PAGEREF _Toc240274854 \h </w:instrText>
             </w:r>
             <w:r>
               <w:rPr>
@@ -1844,7 +1844,7 @@
               <w14:ligatures w14:val="standardContextual"/>
             </w:rPr>
           </w:pPr>
-          <w:hyperlink w:anchor="_Toc240271115" w:history="1">
+          <w:hyperlink w:anchor="_Toc240274855" w:history="1">
             <w:r>
               <w:rPr>
                 <w:rStyle w:val="Hyperlink"/>
@@ -1868,7 +1868,7 @@
               <w:rPr>
                 <w:noProof/>
               </w:rPr>
-              <w:instrText xml:space="preserve"> PAGEREF _Toc240271115 \h </w:instrText>
+              <w:instrText xml:space="preserve"> PAGEREF _Toc240274855 \h </w:instrText>
             </w:r>
             <w:r>
               <w:rPr>
@@ -1911,7 +1911,7 @@
               <w14:ligatures w14:val="standardContextual"/>
             </w:rPr>
           </w:pPr>
-          <w:hyperlink w:anchor="_Toc240271116" w:history="1">
+          <w:hyperlink w:anchor="_Toc240274856" w:history="1">
             <w:r>
               <w:rPr>
                 <w:rStyle w:val="Hyperlink"/>
@@ -1935,7 +1935,7 @@
               <w:rPr>
                 <w:noProof/>
               </w:rPr>
-              <w:instrText xml:space="preserve"> PAGEREF _Toc240271116 \h </w:instrText>
+              <w:instrText xml:space="preserve"> PAGEREF _Toc240274856 \h </w:instrText>
             </w:r>
             <w:r>
               <w:rPr>
@@ -1978,7 +1978,7 @@
               <w14:ligatures w14:val="standardContextual"/>
             </w:rPr>
           </w:pPr>
-          <w:hyperlink w:anchor="_Toc240271117" w:history="1">
+          <w:hyperlink w:anchor="_Toc240274857" w:history="1">
             <w:r>
               <w:rPr>
                 <w:rStyle w:val="Hyperlink"/>
@@ -2002,7 +2002,7 @@
               <w:rPr>
                 <w:noProof/>
               </w:rPr>
-              <w:instrText xml:space="preserve"> PAGEREF _Toc240271117 \h </w:instrText>
+              <w:instrText xml:space="preserve"> PAGEREF _Toc240274857 \h </w:instrText>
             </w:r>
             <w:r>
               <w:rPr>
@@ -2045,7 +2045,7 @@
               <w14:ligatures w14:val="standardContextual"/>
             </w:rPr>
           </w:pPr>
-          <w:hyperlink w:anchor="_Toc240271118" w:history="1">
+          <w:hyperlink w:anchor="_Toc240274858" w:history="1">
             <w:r>
               <w:rPr>
                 <w:rStyle w:val="Hyperlink"/>
@@ -2069,7 +2069,7 @@
               <w:rPr>
                 <w:noProof/>
               </w:rPr>
-              <w:instrText xml:space="preserve"> PAGEREF _Toc240271118 \h </w:instrText>
+              <w:instrText xml:space="preserve"> PAGEREF _Toc240274858 \h </w:instrText>
             </w:r>
             <w:r>
               <w:rPr>
@@ -2112,7 +2112,7 @@
               <w14:ligatures w14:val="standardContextual"/>
             </w:rPr>
           </w:pPr>
-          <w:hyperlink w:anchor="_Toc240271119" w:history="1">
+          <w:hyperlink w:anchor="_Toc240274859" w:history="1">
             <w:r>
               <w:rPr>
                 <w:rStyle w:val="Hyperlink"/>
@@ -2136,7 +2136,7 @@
               <w:rPr>
                 <w:noProof/>
               </w:rPr>
-              <w:instrText xml:space="preserve"> PAGEREF _Toc240271119 \h </w:instrText>
+              <w:instrText xml:space="preserve"> PAGEREF _Toc240274859 \h </w:instrText>
             </w:r>
             <w:r>
               <w:rPr>
@@ -2179,7 +2179,7 @@
               <w14:ligatures w14:val="standardContextual"/>
             </w:rPr>
           </w:pPr>
-          <w:hyperlink w:anchor="_Toc240271120" w:history="1">
+          <w:hyperlink w:anchor="_Toc240274860" w:history="1">
             <w:r>
               <w:rPr>
                 <w:rStyle w:val="Hyperlink"/>
@@ -2203,7 +2203,7 @@
               <w:rPr>
                 <w:noProof/>
               </w:rPr>
-              <w:instrText xml:space="preserve"> PAGEREF _Toc240271120 \h </w:instrText>
+              <w:instrText xml:space="preserve"> PAGEREF _Toc240274860 \h </w:instrText>
             </w:r>
             <w:r>
               <w:rPr>
@@ -2246,7 +2246,7 @@
               <w14:ligatures w14:val="standardContextual"/>
             </w:rPr>
           </w:pPr>
-          <w:hyperlink w:anchor="_Toc240271121" w:history="1">
+          <w:hyperlink w:anchor="_Toc240274861" w:history="1">
             <w:r>
               <w:rPr>
                 <w:rStyle w:val="Hyperlink"/>
@@ -2270,7 +2270,7 @@
               <w:rPr>
                 <w:noProof/>
               </w:rPr>
-              <w:instrText xml:space="preserve"> PAGEREF _Toc240271121 \h </w:instrText>
+              <w:instrText xml:space="preserve"> PAGEREF _Toc240274861 \h </w:instrText>
             </w:r>
             <w:r>
               <w:rPr>
@@ -2313,7 +2313,7 @@
               <w14:ligatures w14:val="standardContextual"/>
             </w:rPr>
           </w:pPr>
-          <w:hyperlink w:anchor="_Toc240271122" w:history="1">
+          <w:hyperlink w:anchor="_Toc240274862" w:history="1">
             <w:r>
               <w:rPr>
                 <w:rStyle w:val="Hyperlink"/>
@@ -2337,7 +2337,7 @@
               <w:rPr>
                 <w:noProof/>
               </w:rPr>
-              <w:instrText xml:space="preserve"> PAGEREF _Toc240271122 \h </w:instrText>
+              <w:instrText xml:space="preserve"> PAGEREF _Toc240274862 \h </w:instrText>
             </w:r>
             <w:r>
               <w:rPr>
@@ -2380,7 +2380,7 @@
               <w14:ligatures w14:val="standardContextual"/>
             </w:rPr>
           </w:pPr>
-          <w:hyperlink w:anchor="_Toc240271123" w:history="1">
+          <w:hyperlink w:anchor="_Toc240274863" w:history="1">
             <w:r>
               <w:rPr>
                 <w:rStyle w:val="Hyperlink"/>
@@ -2404,7 +2404,7 @@
               <w:rPr>
                 <w:noProof/>
               </w:rPr>
-              <w:instrText xml:space="preserve"> PAGEREF _Toc240271123 \h </w:instrText>
+              <w:instrText xml:space="preserve"> PAGEREF _Toc240274863 \h </w:instrText>
             </w:r>
             <w:r>
               <w:rPr>
@@ -2460,7 +2460,7 @@
         <w:pStyle w:val="Heading1"/>
         <w:spacing w:before="320" w:after="160"/>
       </w:pPr>
-      <w:bookmarkStart w:id="1" w:name="_Toc240271098"/>
+      <w:bookmarkStart w:id="1" w:name="_Toc240274838"/>
       <w:r>
         <w:t>1. Giới thiệu</w:t>
       </w:r>
@@ -2471,7 +2471,7 @@
         <w:pStyle w:val="Heading2"/>
         <w:spacing w:before="240" w:after="120"/>
       </w:pPr>
-      <w:bookmarkStart w:id="2" w:name="_Toc240271099"/>
+      <w:bookmarkStart w:id="2" w:name="_Toc240274839"/>
       <w:r>
         <w:t>1.1. Bối cảnh và bài toán</w:t>
       </w:r>
@@ -2498,7 +2498,7 @@
         <w:pStyle w:val="Heading2"/>
         <w:spacing w:before="240" w:after="120"/>
       </w:pPr>
-      <w:bookmarkStart w:id="3" w:name="_Toc240271100"/>
+      <w:bookmarkStart w:id="3" w:name="_Toc240274840"/>
       <w:r>
         <w:t>1.2. Mục tiêu đồ án</w:t>
       </w:r>
@@ -2517,7 +2517,7 @@
         <w:pStyle w:val="Heading1"/>
         <w:spacing w:before="320" w:after="160"/>
       </w:pPr>
-      <w:bookmarkStart w:id="4" w:name="_Toc240271101"/>
+      <w:bookmarkStart w:id="4" w:name="_Toc240274841"/>
       <w:r>
         <w:t>2. Kiến trúc hệ thống tổng quan</w:t>
       </w:r>
@@ -2541,7 +2541,7 @@
           <w:noProof/>
         </w:rPr>
         <w:drawing>
-          <wp:inline distT="0" distB="0" distL="0" distR="0" wp14:anchorId="0053E5CA" wp14:editId="2DA334CD">
+          <wp:inline distT="0" distB="0" distL="0" distR="0" wp14:anchorId="49E328C6" wp14:editId="2AA00754">
             <wp:extent cx="5334000" cy="2724150"/>
             <wp:effectExtent l="0" t="0" r="0" b="0"/>
             <wp:docPr id="1" name="Picture 1"/>
@@ -2686,7 +2686,7 @@
         <w:pStyle w:val="Heading1"/>
         <w:spacing w:before="320" w:after="160"/>
       </w:pPr>
-      <w:bookmarkStart w:id="5" w:name="_Toc240271102"/>
+      <w:bookmarkStart w:id="5" w:name="_Toc240274842"/>
       <w:r>
         <w:t>3. Thiết kế chi tiết từng tầng</w:t>
       </w:r>
@@ -2697,7 +2697,7 @@
         <w:pStyle w:val="Heading2"/>
         <w:spacing w:before="240" w:after="120"/>
       </w:pPr>
-      <w:bookmarkStart w:id="6" w:name="_Toc240271103"/>
+      <w:bookmarkStart w:id="6" w:name="_Toc240274843"/>
       <w:r>
         <w:t>3.1. Tầng IoT (Edge Node)</w:t>
       </w:r>
@@ -3334,7 +3334,7 @@
         <w:pStyle w:val="Heading2"/>
         <w:spacing w:before="240" w:after="120"/>
       </w:pPr>
-      <w:bookmarkStart w:id="7" w:name="_Toc240271104"/>
+      <w:bookmarkStart w:id="7" w:name="_Toc240274844"/>
       <w:r>
         <w:t>3.2. Tầng AI (Federated Learning)</w:t>
       </w:r>
@@ -3345,7 +3345,7 @@
         <w:pStyle w:val="Heading3"/>
         <w:spacing w:before="180" w:after="100"/>
       </w:pPr>
-      <w:bookmarkStart w:id="8" w:name="_Toc240271105"/>
+      <w:bookmarkStart w:id="8" w:name="_Toc240274845"/>
       <w:r>
         <w:t>3.2.1. Kiến trúc mô hình</w:t>
       </w:r>
@@ -3411,7 +3411,7 @@
         <w:pStyle w:val="Heading3"/>
         <w:spacing w:before="180" w:after="100"/>
       </w:pPr>
-      <w:bookmarkStart w:id="9" w:name="_Toc240271106"/>
+      <w:bookmarkStart w:id="9" w:name="_Toc240274846"/>
       <w:r>
         <w:t>3.2.2. Huấn luyện cục bộ (local training)</w:t>
       </w:r>
@@ -3830,7 +3830,7 @@
         <w:pStyle w:val="Heading3"/>
         <w:spacing w:before="180" w:after="100"/>
       </w:pPr>
-      <w:bookmarkStart w:id="10" w:name="_Toc240271107"/>
+      <w:bookmarkStart w:id="10" w:name="_Toc240274847"/>
       <w:r>
         <w:t>3.2.3. Tổng hợp FedAvg</w:t>
       </w:r>
@@ -3874,7 +3874,7 @@
         <w:pStyle w:val="Heading3"/>
         <w:spacing w:before="180" w:after="100"/>
       </w:pPr>
-      <w:bookmarkStart w:id="11" w:name="_Toc240271108"/>
+      <w:bookmarkStart w:id="11" w:name="_Toc240274848"/>
       <w:r>
         <w:t>3.2.4. Vòng lặp huấn luyện và tiêu chí đánh giá</w:t>
       </w:r>
@@ -3984,7 +3984,7 @@
         <w:pStyle w:val="Heading2"/>
         <w:spacing w:before="240" w:after="120"/>
       </w:pPr>
-      <w:bookmarkStart w:id="12" w:name="_Toc240271109"/>
+      <w:bookmarkStart w:id="12" w:name="_Toc240274849"/>
       <w:r>
         <w:t>3.3. Tầng Blockchain (Smart Contract)</w:t>
       </w:r>
@@ -4003,7 +4003,7 @@
         <w:pStyle w:val="Heading3"/>
         <w:spacing w:before="180" w:after="100"/>
       </w:pPr>
-      <w:bookmarkStart w:id="13" w:name="_Toc240271110"/>
+      <w:bookmarkStart w:id="13" w:name="_Toc240274850"/>
       <w:r>
         <w:t>3.3.1. BlockFLToken.sol — token ERC-20 thưởng</w:t>
       </w:r>
@@ -4022,7 +4022,7 @@
         <w:pStyle w:val="Heading3"/>
         <w:spacing w:before="180" w:after="100"/>
       </w:pPr>
-      <w:bookmarkStart w:id="14" w:name="_Toc240271111"/>
+      <w:bookmarkStart w:id="14" w:name="_Toc240274851"/>
       <w:r>
         <w:t>3.3.2. FederatedAggregator.sol — điều phối round FL</w:t>
       </w:r>
@@ -4448,7 +4448,7 @@
         <w:pStyle w:val="Heading1"/>
         <w:spacing w:before="320" w:after="160"/>
       </w:pPr>
-      <w:bookmarkStart w:id="15" w:name="_Toc240271112"/>
+      <w:bookmarkStart w:id="15" w:name="_Toc240274852"/>
       <w:r>
         <w:t>4. Công nghệ sử dụng</w:t>
       </w:r>
@@ -4828,7 +4828,7 @@
         <w:pStyle w:val="Heading1"/>
         <w:spacing w:before="320" w:after="160"/>
       </w:pPr>
-      <w:bookmarkStart w:id="16" w:name="_Toc240271113"/>
+      <w:bookmarkStart w:id="16" w:name="_Toc240274853"/>
       <w:r>
         <w:t>5. Kết quả thực nghiệm</w:t>
       </w:r>
@@ -4839,7 +4839,7 @@
         <w:pStyle w:val="Heading2"/>
         <w:spacing w:before="240" w:after="120"/>
       </w:pPr>
-      <w:bookmarkStart w:id="17" w:name="_Toc240271114"/>
+      <w:bookmarkStart w:id="17" w:name="_Toc240274854"/>
       <w:r>
         <w:t>5.1. Hội tụ của Global Model qua từng round</w:t>
       </w:r>
@@ -4863,10 +4863,10 @@
           <w:noProof/>
         </w:rPr>
         <w:drawing>
-          <wp:inline distT="0" distB="0" distL="0" distR="0" wp14:anchorId="692D5BB6" wp14:editId="0C244909">
+          <wp:inline distT="0" distB="0" distL="0" distR="0" wp14:anchorId="5845DB5C" wp14:editId="0AFD3AF5">
             <wp:extent cx="4572000" cy="2571750"/>
             <wp:effectExtent l="0" t="0" r="0" b="0"/>
-            <wp:docPr id="2111218277" name="Picture 2111218277"/>
+            <wp:docPr id="1545249165" name="Picture 1545249165"/>
             <wp:cNvGraphicFramePr>
               <a:graphicFrameLocks xmlns:a="http://schemas.openxmlformats.org/drawingml/2006/main" noChangeAspect="1"/>
             </wp:cNvGraphicFramePr>
@@ -5636,7 +5636,7 @@
         <w:pStyle w:val="Heading2"/>
         <w:spacing w:before="240" w:after="120"/>
       </w:pPr>
-      <w:bookmarkStart w:id="18" w:name="_Toc240271115"/>
+      <w:bookmarkStart w:id="18" w:name="_Toc240274855"/>
       <w:r>
         <w:t>5.2. So sánh FedAvg với từng node tự huấn luyện riêng lẻ</w:t>
       </w:r>
@@ -5660,10 +5660,10 @@
           <w:noProof/>
         </w:rPr>
         <w:drawing>
-          <wp:inline distT="0" distB="0" distL="0" distR="0" wp14:anchorId="671291AB" wp14:editId="4E6B3E30">
+          <wp:inline distT="0" distB="0" distL="0" distR="0" wp14:anchorId="2FCB7703" wp14:editId="2BA175CC">
             <wp:extent cx="4572000" cy="2571750"/>
             <wp:effectExtent l="0" t="0" r="0" b="0"/>
-            <wp:docPr id="1055044102" name="Picture 1055044102"/>
+            <wp:docPr id="2051763350" name="Picture 2051763350"/>
             <wp:cNvGraphicFramePr>
               <a:graphicFrameLocks xmlns:a="http://schemas.openxmlformats.org/drawingml/2006/main" noChangeAspect="1"/>
             </wp:cNvGraphicFramePr>
@@ -6157,7 +6157,7 @@
         <w:pStyle w:val="Heading2"/>
         <w:spacing w:before="240" w:after="120"/>
       </w:pPr>
-      <w:bookmarkStart w:id="19" w:name="_Toc240271116"/>
+      <w:bookmarkStart w:id="19" w:name="_Toc240274856"/>
       <w:r>
         <w:t>5.3. Kiểm định độ ổn định qua nhiều lần chia dữ liệu</w:t>
       </w:r>
@@ -6181,10 +6181,10 @@
           <w:noProof/>
         </w:rPr>
         <w:drawing>
-          <wp:inline distT="0" distB="0" distL="0" distR="0" wp14:anchorId="033D94F4" wp14:editId="6C87FC20">
+          <wp:inline distT="0" distB="0" distL="0" distR="0" wp14:anchorId="6C30E66D" wp14:editId="2B04E334">
             <wp:extent cx="4572000" cy="2571750"/>
             <wp:effectExtent l="0" t="0" r="0" b="0"/>
-            <wp:docPr id="1250045459" name="Picture 1250045459"/>
+            <wp:docPr id="1593402408" name="Picture 1593402408"/>
             <wp:cNvGraphicFramePr>
               <a:graphicFrameLocks xmlns:a="http://schemas.openxmlformats.org/drawingml/2006/main" noChangeAspect="1"/>
             </wp:cNvGraphicFramePr>
@@ -7818,7 +7818,7 @@
         <w:pStyle w:val="Heading2"/>
         <w:spacing w:before="240" w:after="120"/>
       </w:pPr>
-      <w:bookmarkStart w:id="20" w:name="_Toc240271117"/>
+      <w:bookmarkStart w:id="20" w:name="_Toc240274857"/>
       <w:r>
         <w:t>5.4. Kiểm thử smart contract</w:t>
       </w:r>
@@ -7837,7 +7837,7 @@
         <w:pStyle w:val="Heading2"/>
         <w:spacing w:before="240" w:after="120"/>
       </w:pPr>
-      <w:bookmarkStart w:id="21" w:name="_Toc240271118"/>
+      <w:bookmarkStart w:id="21" w:name="_Toc240274858"/>
       <w:r>
         <w:t>5.5. Minh bạch và chống chối bỏ trên chuỗi</w:t>
       </w:r>
@@ -7856,7 +7856,7 @@
         <w:pStyle w:val="Heading1"/>
         <w:spacing w:before="320" w:after="160"/>
       </w:pPr>
-      <w:bookmarkStart w:id="22" w:name="_Toc240271119"/>
+      <w:bookmarkStart w:id="22" w:name="_Toc240274859"/>
       <w:r>
         <w:t>6. Đánh giá rủi ro và phương án xử lý</w:t>
       </w:r>
@@ -8152,7 +8152,7 @@
         <w:pStyle w:val="Heading1"/>
         <w:spacing w:before="320" w:after="160"/>
       </w:pPr>
-      <w:bookmarkStart w:id="23" w:name="_Toc240271120"/>
+      <w:bookmarkStart w:id="23" w:name="_Toc240274860"/>
       <w:r>
         <w:t>7. Kết luận và hướng phát triển</w:t>
       </w:r>
@@ -8231,7 +8231,7 @@
         <w:pStyle w:val="Heading1"/>
         <w:spacing w:before="320" w:after="160"/>
       </w:pPr>
-      <w:bookmarkStart w:id="24" w:name="_Toc240271121"/>
+      <w:bookmarkStart w:id="24" w:name="_Toc240274861"/>
       <w:r>
         <w:t>8. Cấu trúc repository GitHub</w:t>
       </w:r>
@@ -8354,7 +8354,7 @@
         <w:spacing w:after="160"/>
       </w:pPr>
       <w:r>
-        <w:t>Repository công khai (Public) trên GitHub, link: https://github.com/minhchien2329/BlockFL.</w:t>
+        <w:t>Repository công khai (Public) trên GitHub, link: https://github.com/minhchien2329/BlockFL-nh-p.</w:t>
       </w:r>
     </w:p>
     <w:p>
@@ -8362,7 +8362,7 @@
         <w:pStyle w:val="Heading1"/>
         <w:spacing w:before="320" w:after="160"/>
       </w:pPr>
-      <w:bookmarkStart w:id="25" w:name="_Toc240271122"/>
+      <w:bookmarkStart w:id="25" w:name="_Toc240274862"/>
       <w:r>
         <w:t>9. Phân công nhiệm vụ</w:t>
       </w:r>
@@ -8666,7 +8666,7 @@
         <w:pStyle w:val="Heading1"/>
         <w:spacing w:before="320" w:after="160"/>
       </w:pPr>
-      <w:bookmarkStart w:id="26" w:name="_Toc240271123"/>
+      <w:bookmarkStart w:id="26" w:name="_Toc240274863"/>
       <w:r>
         <w:t>10. Tài liệu tham khảo</w:t>
       </w:r>
@@ -8872,10 +8872,10 @@
 <file path=word/numbering.xml><?xml version="1.0" encoding="utf-8"?>
 <w:numbering xmlns:wpc="http://schemas.microsoft.com/office/word/2010/wordprocessingCanvas" xmlns:cx="http://schemas.microsoft.com/office/drawing/2014/chartex" xmlns:cx1="http://schemas.microsoft.com/office/drawing/2015/9/8/chartex" xmlns:cx2="http://schemas.microsoft.com/office/drawing/2015/10/21/chartex" xmlns:cx3="http://schemas.microsoft.com/office/drawing/2016/5/9/chartex" xmlns:cx4="http://schemas.microsoft.com/office/drawing/2016/5/10/chartex" xmlns:cx5="http://schemas.microsoft.com/office/drawing/2016/5/11/chartex" xmlns:cx6="http://schemas.microsoft.com/office/drawing/2016/5/12/chartex" xmlns:cx7="http://schemas.microsoft.com/office/drawing/2016/5/13/chartex" xmlns:cx8="http://schemas.microsoft.com/office/drawing/2016/5/14/chartex" xmlns:mc="http://schemas.openxmlformats.org/markup-compatibility/2006" xmlns:aink="http://schemas.microsoft.com/office/drawing/2016/ink" xmlns:am3d="http://schemas.microsoft.com/office/drawing/2017/model3d" xmlns:o="urn:schemas-microsoft-com:office:office" xmlns:oel="http://schemas.microsoft.com/office/2019/extlst" xmlns:r="http://schemas.openxmlformats.org/officeDocument/2006/relationships" xmlns:m="http://schemas.openxmlformats.org/officeDocument/2006/math" xmlns:v="urn:schemas-microsoft-com:vml" xmlns:wp14="http://schemas.microsoft.com/office/word/2010/wordprocessingDrawing" xmlns:wp="http://schemas.openxmlformats.org/drawingml/2006/wordprocessingDrawing" xmlns:w10="urn:schemas-microsoft-com:office:word" xmlns:w="http://schemas.openxmlformats.org/wordprocessingml/2006/main" xmlns:w14="http://schemas.microsoft.com/office/word/2010/wordml" xmlns:w15="http://schemas.microsoft.com/office/word/2012/wordml" xmlns:w16cex="http://schemas.microsoft.com/office/word/2018/wordml/cex" xmlns:w16cid="http://schemas.microsoft.com/office/word/2016/wordml/cid" xmlns:w16="http://schemas.microsoft.com/office/word/2018/wordml" xmlns:w16du="http://schemas.microsoft.com/office/word/2023/wordml/word16du" xmlns:w16sdtdh="http://schemas.microsoft.com/office/word/2020/wordml/sdtdatahash" xmlns:w16sdtfl="http://schemas.microsoft.com/office/word/2024/wordml/sdtformatlock" xmlns:w16se="http://schemas.microsoft.com/office/word/2015/wordml/symex" xmlns:wpg="http://schemas.microsoft.com/office/word/2010/wordprocessingGroup" xmlns:wpi="http://schemas.microsoft.com/office/word/2010/wordprocessingInk" xmlns:wne="http://schemas.microsoft.com/office/word/2006/wordml" xmlns:wps="http://schemas.microsoft.com/office/word/2010/wordprocessingShape" mc:Ignorable="w14 w15 w16se w16cid w16 w16cex w16sdtdh w16sdtfl w16du wp14">
   <w:abstractNum w:abstractNumId="0" w15:restartNumberingAfterBreak="0">
-    <w:nsid w:val="14787FD9"/>
+    <w:nsid w:val="6DB459CE"/>
     <w:multiLevelType w:val="hybridMultilevel"/>
-    <w:tmpl w:val="18A86C4C"/>
-    <w:lvl w:ilvl="0" w:tplc="3B464356">
+    <w:tmpl w:val="7D580A2E"/>
+    <w:lvl w:ilvl="0" w:tplc="F07C69FC">
       <w:start w:val="1"/>
       <w:numFmt w:val="bullet"/>
       <w:lvlText w:val="●"/>
@@ -8884,7 +8884,7 @@
         <w:ind w:left="720" w:hanging="360"/>
       </w:pPr>
     </w:lvl>
-    <w:lvl w:ilvl="1" w:tplc="A6241EC0">
+    <w:lvl w:ilvl="1" w:tplc="8902A010">
       <w:start w:val="1"/>
       <w:numFmt w:val="bullet"/>
       <w:lvlText w:val="○"/>
@@ -8893,7 +8893,7 @@
         <w:ind w:left="1440" w:hanging="360"/>
       </w:pPr>
     </w:lvl>
-    <w:lvl w:ilvl="2" w:tplc="0E44C6BE">
+    <w:lvl w:ilvl="2" w:tplc="29702786">
       <w:start w:val="1"/>
       <w:numFmt w:val="bullet"/>
       <w:lvlText w:val="■"/>
@@ -8902,7 +8902,7 @@
         <w:ind w:left="2160" w:hanging="360"/>
       </w:pPr>
     </w:lvl>
-    <w:lvl w:ilvl="3" w:tplc="D9D0B762">
+    <w:lvl w:ilvl="3" w:tplc="A4A261D8">
       <w:start w:val="1"/>
       <w:numFmt w:val="bullet"/>
       <w:lvlText w:val="●"/>
@@ -8911,7 +8911,7 @@
         <w:ind w:left="2880" w:hanging="360"/>
       </w:pPr>
     </w:lvl>
-    <w:lvl w:ilvl="4" w:tplc="B210A86A">
+    <w:lvl w:ilvl="4" w:tplc="1E3AF7F6">
       <w:start w:val="1"/>
       <w:numFmt w:val="bullet"/>
       <w:lvlText w:val="○"/>
@@ -8920,7 +8920,7 @@
         <w:ind w:left="3600" w:hanging="360"/>
       </w:pPr>
     </w:lvl>
-    <w:lvl w:ilvl="5" w:tplc="8A9C05D2">
+    <w:lvl w:ilvl="5" w:tplc="62D897F4">
       <w:start w:val="1"/>
       <w:numFmt w:val="bullet"/>
       <w:lvlText w:val="■"/>
@@ -8929,7 +8929,7 @@
         <w:ind w:left="4320" w:hanging="360"/>
       </w:pPr>
     </w:lvl>
-    <w:lvl w:ilvl="6" w:tplc="BEB0FF9E">
+    <w:lvl w:ilvl="6" w:tplc="D2CA3D0E">
       <w:start w:val="1"/>
       <w:numFmt w:val="bullet"/>
       <w:lvlText w:val="●"/>
@@ -8938,7 +8938,7 @@
         <w:ind w:left="5040" w:hanging="360"/>
       </w:pPr>
     </w:lvl>
-    <w:lvl w:ilvl="7" w:tplc="EEBAFAA8">
+    <w:lvl w:ilvl="7" w:tplc="B1AECCDE">
       <w:start w:val="1"/>
       <w:numFmt w:val="bullet"/>
       <w:lvlText w:val="●"/>
@@ -8947,7 +8947,7 @@
         <w:ind w:left="5760" w:hanging="360"/>
       </w:pPr>
     </w:lvl>
-    <w:lvl w:ilvl="8" w:tplc="80E6742C">
+    <w:lvl w:ilvl="8" w:tplc="EFD0A682">
       <w:start w:val="1"/>
       <w:numFmt w:val="bullet"/>
       <w:lvlText w:val="●"/>
@@ -8957,7 +8957,7 @@
       </w:pPr>
     </w:lvl>
   </w:abstractNum>
-  <w:num w:numId="1" w16cid:durableId="1540048925">
+  <w:num w:numId="1" w16cid:durableId="1028795189">
     <w:abstractNumId w:val="0"/>
     <w:lvlOverride w:ilvl="0">
       <w:startOverride w:val="1"/>
@@ -9573,7 +9573,7 @@
     <w:autoRedefine/>
     <w:uiPriority w:val="39"/>
     <w:unhideWhenUsed/>
-    <w:rsid w:val="005A3169"/>
+    <w:rsid w:val="000F3FFA"/>
     <w:pPr>
       <w:spacing w:after="100"/>
     </w:pPr>
@@ -9585,7 +9585,7 @@
     <w:autoRedefine/>
     <w:uiPriority w:val="39"/>
     <w:unhideWhenUsed/>
-    <w:rsid w:val="005A3169"/>
+    <w:rsid w:val="000F3FFA"/>
     <w:pPr>
       <w:spacing w:after="100"/>
       <w:ind w:left="220"/>
@@ -9598,7 +9598,7 @@
     <w:autoRedefine/>
     <w:uiPriority w:val="39"/>
     <w:unhideWhenUsed/>
-    <w:rsid w:val="005A3169"/>
+    <w:rsid w:val="000F3FFA"/>
     <w:pPr>
       <w:spacing w:after="100"/>
       <w:ind w:left="440"/>

</xml_diff>